<commit_message>
Update member evaluation template path to use .docx format
</commit_message>
<xml_diff>
--- a/app/assets/templates/member_evaluation_template.docx
+++ b/app/assets/templates/member_evaluation_template.docx
@@ -257,21 +257,10 @@
       </w:pPr>
       <w:r>
         <w:rPr>
-          <w:b/>
+          <w:rFonts w:ascii="Times New Roman" w:hAnsi="Times New Roman" w:eastAsia="Times New Roman"/>
+          <w:sz w:val="20"/>
         </w:rPr>
-        <w:t xml:space="preserve">Kỳ đánh giá: </w:t>
-      </w:r>
-      <w:r>
-        <w:rPr>
-          <w:bCs w:val="0"/>
-        </w:rPr>
-        <w:t>Tháng/Quý/Kỳ hoạt động:</w:t>
-      </w:r>
-      <w:r>
-        <w:rPr>
-          <w:bCs w:val="0"/>
-        </w:rPr>
-        <w:tab/>
+        <w:t>Kỳ đánh giá: {{ cycle_code }} - {{ cycle_name }}</w:t>
       </w:r>
     </w:p>
     <w:p>
@@ -288,15 +277,10 @@
       </w:pPr>
       <w:r>
         <w:rPr>
-          <w:b/>
+          <w:rFonts w:ascii="Times New Roman" w:hAnsi="Times New Roman" w:eastAsia="Times New Roman"/>
+          <w:sz w:val="20"/>
         </w:rPr>
-        <w:t>Ngày lập phiếu:</w:t>
-      </w:r>
-      <w:r>
-        <w:rPr>
-          <w:bCs w:val="0"/>
-        </w:rPr>
-        <w:t xml:space="preserve"> ……/……/20…….</w:t>
+        <w:t>Ngày lập phiếu: {{ generated_day }}/{{ generated_month }}/{{ generated_year }}</w:t>
       </w:r>
     </w:p>
     <w:p>
@@ -316,21 +300,10 @@
       </w:pPr>
       <w:r>
         <w:rPr>
-          <w:b/>
+          <w:rFonts w:ascii="Times New Roman" w:hAnsi="Times New Roman" w:eastAsia="Times New Roman"/>
+          <w:sz w:val="20"/>
         </w:rPr>
-        <w:t>Người đánh giá:</w:t>
-      </w:r>
-      <w:r>
-        <w:rPr>
-          <w:bCs w:val="0"/>
-        </w:rPr>
-        <w:t xml:space="preserve"> </w:t>
-      </w:r>
-      <w:r>
-        <w:rPr>
-          <w:bCs w:val="0"/>
-        </w:rPr>
-        <w:tab/>
+        <w:t>Người đánh giá: {{ exported_by }}</w:t>
       </w:r>
     </w:p>
     <w:p>
@@ -352,21 +325,10 @@
       </w:pPr>
       <w:r>
         <w:rPr>
-          <w:b/>
+          <w:rFonts w:ascii="Times New Roman" w:hAnsi="Times New Roman" w:eastAsia="Times New Roman"/>
+          <w:sz w:val="20"/>
         </w:rPr>
-        <w:t>Đơn vị đánh giá:</w:t>
-      </w:r>
-      <w:r>
-        <w:rPr>
-          <w:bCs w:val="0"/>
-        </w:rPr>
-        <w:t xml:space="preserve"> Ban/Tổ: </w:t>
-      </w:r>
-      <w:r>
-        <w:rPr>
-          <w:bCs w:val="0"/>
-        </w:rPr>
-        <w:tab/>
+        <w:t>Đơn vị đánh giá: Ban/Tổ: {{ unit_code }}</w:t>
       </w:r>
     </w:p>
     <w:p>
@@ -395,22 +357,12 @@
       </w:pPr>
       <w:r>
         <w:rPr>
-          <w:bCs w:val="0"/>
+          <w:rFonts w:ascii="Times New Roman" w:hAnsi="Times New Roman" w:eastAsia="Times New Roman"/>
+          <w:sz w:val="20"/>
         </w:rPr>
-        <w:t xml:space="preserve">Họ và tên: </w:t>
-      </w:r>
-      <w:r>
-        <w:rPr>
-          <w:bCs w:val="0"/>
-        </w:rPr>
+        <w:t>Họ và tên: {{ ho_ten }}</w:t>
         <w:tab/>
-        <w:t>Nam/Nữ:</w:t>
-      </w:r>
-      <w:r>
-        <w:rPr>
-          <w:bCs w:val="0"/>
-        </w:rPr>
-        <w:tab/>
+        <w:t>Nam/Nữ: {{ gender }}</w:t>
       </w:r>
     </w:p>
     <w:p>
@@ -427,15 +379,10 @@
       </w:pPr>
       <w:r>
         <w:rPr>
-          <w:bCs w:val="0"/>
+          <w:rFonts w:ascii="Times New Roman" w:hAnsi="Times New Roman" w:eastAsia="Times New Roman"/>
+          <w:sz w:val="20"/>
         </w:rPr>
-        <w:t xml:space="preserve">Mã số sinh viên: </w:t>
-      </w:r>
-      <w:r>
-        <w:rPr>
-          <w:bCs w:val="0"/>
-        </w:rPr>
-        <w:tab/>
+        <w:t>Mã số sinh viên: {{ mssv }}</w:t>
       </w:r>
     </w:p>
     <w:p>
@@ -453,33 +400,12 @@
       </w:pPr>
       <w:r>
         <w:rPr>
-          <w:bCs w:val="0"/>
+          <w:rFonts w:ascii="Times New Roman" w:hAnsi="Times New Roman" w:eastAsia="Times New Roman"/>
+          <w:sz w:val="20"/>
         </w:rPr>
-        <w:t xml:space="preserve">Số điện </w:t>
-      </w:r>
-      <w:r>
-        <w:rPr>
-          <w:bCs w:val="0"/>
-        </w:rPr>
-        <w:t xml:space="preserve">thoại: </w:t>
-      </w:r>
-      <w:r>
-        <w:rPr>
-          <w:bCs w:val="0"/>
-        </w:rPr>
+        <w:t>Số điện thoại: {{ phone }}</w:t>
         <w:tab/>
-      </w:r>
-      <w:r>
-        <w:rPr>
-          <w:bCs w:val="0"/>
-        </w:rPr>
-        <w:t xml:space="preserve">Email: </w:t>
-      </w:r>
-      <w:r>
-        <w:rPr>
-          <w:bCs w:val="0"/>
-        </w:rPr>
-        <w:tab/>
+        <w:t>Email: {{ email }}</w:t>
       </w:r>
     </w:p>
     <w:p>
@@ -496,15 +422,10 @@
       </w:pPr>
       <w:r>
         <w:rPr>
-          <w:bCs w:val="0"/>
+          <w:rFonts w:ascii="Times New Roman" w:hAnsi="Times New Roman" w:eastAsia="Times New Roman"/>
+          <w:sz w:val="20"/>
         </w:rPr>
-        <w:t xml:space="preserve">Ban/Tổ chính: </w:t>
-      </w:r>
-      <w:r>
-        <w:rPr>
-          <w:bCs w:val="0"/>
-        </w:rPr>
-        <w:tab/>
+        <w:t>Ban/Tổ chính: {{ unit_code }}</w:t>
       </w:r>
     </w:p>
     <w:p>
@@ -520,10 +441,11 @@
         <w:spacing w:after="0"/>
       </w:pPr>
       <w:r>
-        <w:t xml:space="preserve">Ban/Tổ phụ (nếu có): </w:t>
-      </w:r>
-      <w:r>
-        <w:tab/>
+        <w:rPr>
+          <w:rFonts w:ascii="Times New Roman" w:hAnsi="Times New Roman" w:eastAsia="Times New Roman"/>
+          <w:sz w:val="20"/>
+        </w:rPr>
+        <w:t>Ban/Tổ phụ (nếu có): {{ secondary_units }}</w:t>
       </w:r>
     </w:p>
     <w:p>
@@ -544,135 +466,10 @@
       </w:pPr>
       <w:r>
         <w:rPr>
-          <w:bCs w:val="0"/>
+          <w:rFonts w:ascii="Times New Roman" w:hAnsi="Times New Roman" w:eastAsia="Times New Roman"/>
+          <w:sz w:val="20"/>
         </w:rPr>
-        <w:t>Chức vụ hiện tại:</w:t>
-      </w:r>
-      <w:r>
-        <w:t xml:space="preserve"> </w:t>
-      </w:r>
-      <w:sdt>
-        <w:sdtPr>
-          <w:id w:val="45966362"/>
-          <w14:checkbox>
-            <w14:checked w14:val="0"/>
-            <w14:checkedState w14:val="2612" w14:font="MS Gothic"/>
-            <w14:uncheckedState w14:val="2610" w14:font="MS Gothic"/>
-          </w14:checkbox>
-        </w:sdtPr>
-        <w:sdtContent>
-          <w:r>
-            <w:rPr>
-              <w:rFonts w:ascii="MS Gothic" w:eastAsia="MS Gothic" w:hAnsi="MS Gothic" w:hint="eastAsia"/>
-            </w:rPr>
-            <w:t>☐</w:t>
-          </w:r>
-        </w:sdtContent>
-      </w:sdt>
-      <w:r>
-        <w:t xml:space="preserve"> Thành viên; </w:t>
-      </w:r>
-      <w:r>
-        <w:tab/>
-      </w:r>
-      <w:sdt>
-        <w:sdtPr>
-          <w:id w:val="-1568030568"/>
-          <w14:checkbox>
-            <w14:checked w14:val="0"/>
-            <w14:checkedState w14:val="2612" w14:font="MS Gothic"/>
-            <w14:uncheckedState w14:val="2610" w14:font="MS Gothic"/>
-          </w14:checkbox>
-        </w:sdtPr>
-        <w:sdtContent>
-          <w:r>
-            <w:rPr>
-              <w:rFonts w:ascii="MS Gothic" w:eastAsia="MS Gothic" w:hAnsi="MS Gothic" w:hint="eastAsia"/>
-            </w:rPr>
-            <w:t>☐</w:t>
-          </w:r>
-        </w:sdtContent>
-      </w:sdt>
-      <w:r>
-        <w:t xml:space="preserve"> Trưởng nhóm; </w:t>
-      </w:r>
-      <w:r>
-        <w:br/>
-      </w:r>
-      <w:r>
-        <w:tab/>
-      </w:r>
-      <w:sdt>
-        <w:sdtPr>
-          <w:id w:val="-1977440550"/>
-          <w14:checkbox>
-            <w14:checked w14:val="0"/>
-            <w14:checkedState w14:val="2612" w14:font="MS Gothic"/>
-            <w14:uncheckedState w14:val="2610" w14:font="MS Gothic"/>
-          </w14:checkbox>
-        </w:sdtPr>
-        <w:sdtContent>
-          <w:r>
-            <w:rPr>
-              <w:rFonts w:ascii="MS Gothic" w:eastAsia="MS Gothic" w:hAnsi="MS Gothic" w:hint="eastAsia"/>
-            </w:rPr>
-            <w:t>☐</w:t>
-          </w:r>
-        </w:sdtContent>
-      </w:sdt>
-      <w:r>
-        <w:t xml:space="preserve"> </w:t>
-      </w:r>
-      <w:r>
-        <w:t xml:space="preserve">Phó ban; </w:t>
-      </w:r>
-      <w:r>
-        <w:tab/>
-      </w:r>
-      <w:sdt>
-        <w:sdtPr>
-          <w:id w:val="1673058591"/>
-          <w14:checkbox>
-            <w14:checked w14:val="0"/>
-            <w14:checkedState w14:val="2612" w14:font="MS Gothic"/>
-            <w14:uncheckedState w14:val="2610" w14:font="MS Gothic"/>
-          </w14:checkbox>
-        </w:sdtPr>
-        <w:sdtContent>
-          <w:r>
-            <w:rPr>
-              <w:rFonts w:ascii="MS Gothic" w:eastAsia="MS Gothic" w:hAnsi="MS Gothic" w:hint="eastAsia"/>
-            </w:rPr>
-            <w:t>☐</w:t>
-          </w:r>
-        </w:sdtContent>
-      </w:sdt>
-      <w:r>
-        <w:t xml:space="preserve"> Trưởng ban; </w:t>
-      </w:r>
-      <w:r>
-        <w:tab/>
-      </w:r>
-      <w:sdt>
-        <w:sdtPr>
-          <w:id w:val="-1761441831"/>
-          <w14:checkbox>
-            <w14:checked w14:val="0"/>
-            <w14:checkedState w14:val="2612" w14:font="MS Gothic"/>
-            <w14:uncheckedState w14:val="2610" w14:font="MS Gothic"/>
-          </w14:checkbox>
-        </w:sdtPr>
-        <w:sdtContent>
-          <w:r>
-            <w:rPr>
-              <w:rFonts w:ascii="MS Gothic" w:eastAsia="MS Gothic" w:hAnsi="MS Gothic" w:hint="eastAsia"/>
-            </w:rPr>
-            <w:t>☐</w:t>
-          </w:r>
-        </w:sdtContent>
-      </w:sdt>
-      <w:r>
-        <w:t xml:space="preserve"> Khác</w:t>
+        <w:t>Chức vụ hiện tại: {{ role_title }}</w:t>
       </w:r>
     </w:p>
     <w:p>
@@ -688,49 +485,11 @@
         <w:spacing w:after="0"/>
       </w:pPr>
       <w:r>
-        <w:t xml:space="preserve">Trạng thái thành viên: </w:t>
-      </w:r>
-      <w:sdt>
-        <w:sdtPr>
-          <w:id w:val="903885952"/>
-          <w14:checkbox>
-            <w14:checked w14:val="0"/>
-            <w14:checkedState w14:val="2612" w14:font="MS Gothic"/>
-            <w14:uncheckedState w14:val="2610" w14:font="MS Gothic"/>
-          </w14:checkbox>
-        </w:sdtPr>
-        <w:sdtContent>
-          <w:r>
-            <w:rPr>
-              <w:rFonts w:ascii="MS Gothic" w:eastAsia="MS Gothic" w:hAnsi="MS Gothic" w:hint="eastAsia"/>
-            </w:rPr>
-            <w:t>☐</w:t>
-          </w:r>
-        </w:sdtContent>
-      </w:sdt>
-      <w:r>
-        <w:t xml:space="preserve"> Chính thức; </w:t>
-      </w:r>
-      <w:sdt>
-        <w:sdtPr>
-          <w:id w:val="1772969494"/>
-          <w14:checkbox>
-            <w14:checked w14:val="0"/>
-            <w14:checkedState w14:val="2612" w14:font="MS Gothic"/>
-            <w14:uncheckedState w14:val="2610" w14:font="MS Gothic"/>
-          </w14:checkbox>
-        </w:sdtPr>
-        <w:sdtContent>
-          <w:r>
-            <w:rPr>
-              <w:rFonts w:ascii="MS Gothic" w:eastAsia="MS Gothic" w:hAnsi="MS Gothic" w:hint="eastAsia"/>
-            </w:rPr>
-            <w:t>☐</w:t>
-          </w:r>
-        </w:sdtContent>
-      </w:sdt>
-      <w:r>
-        <w:t xml:space="preserve"> Cộng tác viên</w:t>
+        <w:rPr>
+          <w:rFonts w:ascii="Times New Roman" w:hAnsi="Times New Roman" w:eastAsia="Times New Roman"/>
+          <w:sz w:val="20"/>
+        </w:rPr>
+        <w:t>Trạng thái thành viên: {{ member_status }}</w:t>
       </w:r>
     </w:p>
     <w:p>
@@ -746,91 +505,11 @@
         <w:spacing w:after="0"/>
       </w:pPr>
       <w:r>
-        <w:t xml:space="preserve">Chu kỳ đánh gái: </w:t>
-      </w:r>
-      <w:sdt>
-        <w:sdtPr>
-          <w:id w:val="499780106"/>
-          <w14:checkbox>
-            <w14:checked w14:val="0"/>
-            <w14:checkedState w14:val="2612" w14:font="MS Gothic"/>
-            <w14:uncheckedState w14:val="2610" w14:font="MS Gothic"/>
-          </w14:checkbox>
-        </w:sdtPr>
-        <w:sdtContent>
-          <w:r>
-            <w:rPr>
-              <w:rFonts w:ascii="MS Gothic" w:eastAsia="MS Gothic" w:hAnsi="MS Gothic" w:hint="eastAsia"/>
-            </w:rPr>
-            <w:t>☐</w:t>
-          </w:r>
-        </w:sdtContent>
-      </w:sdt>
-      <w:r>
-        <w:t xml:space="preserve"> Tháng; </w:t>
-      </w:r>
-      <w:sdt>
-        <w:sdtPr>
-          <w:id w:val="1787929401"/>
-          <w14:checkbox>
-            <w14:checked w14:val="0"/>
-            <w14:checkedState w14:val="2612" w14:font="MS Gothic"/>
-            <w14:uncheckedState w14:val="2610" w14:font="MS Gothic"/>
-          </w14:checkbox>
-        </w:sdtPr>
-        <w:sdtContent>
-          <w:r>
-            <w:rPr>
-              <w:rFonts w:ascii="MS Gothic" w:eastAsia="MS Gothic" w:hAnsi="MS Gothic" w:hint="eastAsia"/>
-            </w:rPr>
-            <w:t>☐</w:t>
-          </w:r>
-        </w:sdtContent>
-      </w:sdt>
-      <w:r>
-        <w:t xml:space="preserve"> Quý; </w:t>
-      </w:r>
-      <w:sdt>
-        <w:sdtPr>
-          <w:id w:val="1789545496"/>
-          <w14:checkbox>
-            <w14:checked w14:val="0"/>
-            <w14:checkedState w14:val="2612" w14:font="MS Gothic"/>
-            <w14:uncheckedState w14:val="2610" w14:font="MS Gothic"/>
-          </w14:checkbox>
-        </w:sdtPr>
-        <w:sdtContent>
-          <w:r>
-            <w:rPr>
-              <w:rFonts w:ascii="MS Gothic" w:eastAsia="MS Gothic" w:hAnsi="MS Gothic" w:hint="eastAsia"/>
-            </w:rPr>
-            <w:t>☐</w:t>
-          </w:r>
-        </w:sdtContent>
-      </w:sdt>
-      <w:r>
-        <w:t xml:space="preserve"> Sự kiện; </w:t>
-      </w:r>
-      <w:sdt>
-        <w:sdtPr>
-          <w:id w:val="1998072811"/>
-          <w14:checkbox>
-            <w14:checked w14:val="0"/>
-            <w14:checkedState w14:val="2612" w14:font="MS Gothic"/>
-            <w14:uncheckedState w14:val="2610" w14:font="MS Gothic"/>
-          </w14:checkbox>
-        </w:sdtPr>
-        <w:sdtContent>
-          <w:r>
-            <w:rPr>
-              <w:rFonts w:ascii="MS Gothic" w:eastAsia="MS Gothic" w:hAnsi="MS Gothic" w:hint="eastAsia"/>
-            </w:rPr>
-            <w:t>☐</w:t>
-          </w:r>
-        </w:sdtContent>
-      </w:sdt>
-      <w:r>
-        <w:t xml:space="preserve"> Đột xuất</w:t>
+        <w:rPr>
+          <w:rFonts w:ascii="Times New Roman" w:hAnsi="Times New Roman" w:eastAsia="Times New Roman"/>
+          <w:sz w:val="20"/>
+        </w:rPr>
+        <w:t>Chu kỳ đánh giá: {{ cycle_type_label }}</w:t>
       </w:r>
     </w:p>
     <w:p>
@@ -1057,7 +736,11 @@
               <w:cnfStyle w:val="000000000000" w:firstRow="0" w:lastRow="0" w:firstColumn="0" w:lastColumn="0" w:oddVBand="0" w:evenVBand="0" w:oddHBand="0" w:evenHBand="0" w:firstRowFirstColumn="0" w:firstRowLastColumn="0" w:lastRowFirstColumn="0" w:lastRowLastColumn="0"/>
             </w:pPr>
             <w:r>
-              <w:t>…</w:t>
+              <w:rPr>
+                <w:rFonts w:ascii="Times New Roman" w:hAnsi="Times New Roman" w:eastAsia="Times New Roman"/>
+                <w:sz w:val="14"/>
+              </w:rPr>
+              <w:t>{{ component_i_score }}</w:t>
             </w:r>
           </w:p>
         </w:tc>
@@ -1076,7 +759,11 @@
               <w:cnfStyle w:val="000000000000" w:firstRow="0" w:lastRow="0" w:firstColumn="0" w:lastColumn="0" w:oddVBand="0" w:evenVBand="0" w:oddHBand="0" w:evenHBand="0" w:firstRowFirstColumn="0" w:firstRowLastColumn="0" w:lastRowFirstColumn="0" w:lastRowLastColumn="0"/>
             </w:pPr>
             <w:r>
-              <w:t>…</w:t>
+              <w:rPr>
+                <w:rFonts w:ascii="Times New Roman" w:hAnsi="Times New Roman" w:eastAsia="Times New Roman"/>
+                <w:sz w:val="14"/>
+              </w:rPr>
+              <w:t>{{ component_i_adjustment }}</w:t>
             </w:r>
           </w:p>
         </w:tc>
@@ -1095,7 +782,11 @@
               <w:cnfStyle w:val="000000000000" w:firstRow="0" w:lastRow="0" w:firstColumn="0" w:lastColumn="0" w:oddVBand="0" w:evenVBand="0" w:oddHBand="0" w:evenHBand="0" w:firstRowFirstColumn="0" w:firstRowLastColumn="0" w:lastRowFirstColumn="0" w:lastRowLastColumn="0"/>
             </w:pPr>
             <w:r>
-              <w:t>…</w:t>
+              <w:rPr>
+                <w:rFonts w:ascii="Times New Roman" w:hAnsi="Times New Roman" w:eastAsia="Times New Roman"/>
+                <w:sz w:val="14"/>
+              </w:rPr>
+              <w:t>{{ component_i_score }}</w:t>
             </w:r>
           </w:p>
         </w:tc>
@@ -1176,7 +867,11 @@
               <w:cnfStyle w:val="000000000000" w:firstRow="0" w:lastRow="0" w:firstColumn="0" w:lastColumn="0" w:oddVBand="0" w:evenVBand="0" w:oddHBand="0" w:evenHBand="0" w:firstRowFirstColumn="0" w:firstRowLastColumn="0" w:lastRowFirstColumn="0" w:lastRowLastColumn="0"/>
             </w:pPr>
             <w:r>
-              <w:t>…</w:t>
+              <w:rPr>
+                <w:rFonts w:ascii="Times New Roman" w:hAnsi="Times New Roman" w:eastAsia="Times New Roman"/>
+                <w:sz w:val="14"/>
+              </w:rPr>
+              <w:t>{{ component_ii_score }}</w:t>
             </w:r>
           </w:p>
         </w:tc>
@@ -1195,7 +890,11 @@
               <w:cnfStyle w:val="000000000000" w:firstRow="0" w:lastRow="0" w:firstColumn="0" w:lastColumn="0" w:oddVBand="0" w:evenVBand="0" w:oddHBand="0" w:evenHBand="0" w:firstRowFirstColumn="0" w:firstRowLastColumn="0" w:lastRowFirstColumn="0" w:lastRowLastColumn="0"/>
             </w:pPr>
             <w:r>
-              <w:t>…</w:t>
+              <w:rPr>
+                <w:rFonts w:ascii="Times New Roman" w:hAnsi="Times New Roman" w:eastAsia="Times New Roman"/>
+                <w:sz w:val="14"/>
+              </w:rPr>
+              <w:t>{{ component_ii_adjustment }}</w:t>
             </w:r>
           </w:p>
         </w:tc>
@@ -1214,7 +913,11 @@
               <w:cnfStyle w:val="000000000000" w:firstRow="0" w:lastRow="0" w:firstColumn="0" w:lastColumn="0" w:oddVBand="0" w:evenVBand="0" w:oddHBand="0" w:evenHBand="0" w:firstRowFirstColumn="0" w:firstRowLastColumn="0" w:lastRowFirstColumn="0" w:lastRowLastColumn="0"/>
             </w:pPr>
             <w:r>
-              <w:t>…</w:t>
+              <w:rPr>
+                <w:rFonts w:ascii="Times New Roman" w:hAnsi="Times New Roman" w:eastAsia="Times New Roman"/>
+                <w:sz w:val="14"/>
+              </w:rPr>
+              <w:t>{{ component_ii_score }}</w:t>
             </w:r>
           </w:p>
         </w:tc>
@@ -1295,7 +998,11 @@
               <w:cnfStyle w:val="000000000000" w:firstRow="0" w:lastRow="0" w:firstColumn="0" w:lastColumn="0" w:oddVBand="0" w:evenVBand="0" w:oddHBand="0" w:evenHBand="0" w:firstRowFirstColumn="0" w:firstRowLastColumn="0" w:lastRowFirstColumn="0" w:lastRowLastColumn="0"/>
             </w:pPr>
             <w:r>
-              <w:t>…</w:t>
+              <w:rPr>
+                <w:rFonts w:ascii="Times New Roman" w:hAnsi="Times New Roman" w:eastAsia="Times New Roman"/>
+                <w:sz w:val="14"/>
+              </w:rPr>
+              <w:t>{{ component_iii_a_score }}</w:t>
             </w:r>
           </w:p>
         </w:tc>
@@ -1314,7 +1021,11 @@
               <w:cnfStyle w:val="000000000000" w:firstRow="0" w:lastRow="0" w:firstColumn="0" w:lastColumn="0" w:oddVBand="0" w:evenVBand="0" w:oddHBand="0" w:evenHBand="0" w:firstRowFirstColumn="0" w:firstRowLastColumn="0" w:lastRowFirstColumn="0" w:lastRowLastColumn="0"/>
             </w:pPr>
             <w:r>
-              <w:t>…</w:t>
+              <w:rPr>
+                <w:rFonts w:ascii="Times New Roman" w:hAnsi="Times New Roman" w:eastAsia="Times New Roman"/>
+                <w:sz w:val="14"/>
+              </w:rPr>
+              <w:t>{{ component_iii_a_adjustment }}</w:t>
             </w:r>
           </w:p>
         </w:tc>
@@ -1333,7 +1044,11 @@
               <w:cnfStyle w:val="000000000000" w:firstRow="0" w:lastRow="0" w:firstColumn="0" w:lastColumn="0" w:oddVBand="0" w:evenVBand="0" w:oddHBand="0" w:evenHBand="0" w:firstRowFirstColumn="0" w:firstRowLastColumn="0" w:lastRowFirstColumn="0" w:lastRowLastColumn="0"/>
             </w:pPr>
             <w:r>
-              <w:t>…</w:t>
+              <w:rPr>
+                <w:rFonts w:ascii="Times New Roman" w:hAnsi="Times New Roman" w:eastAsia="Times New Roman"/>
+                <w:sz w:val="14"/>
+              </w:rPr>
+              <w:t>{{ component_iii_a_score }}</w:t>
             </w:r>
           </w:p>
         </w:tc>
@@ -1414,7 +1129,11 @@
               <w:cnfStyle w:val="000000000000" w:firstRow="0" w:lastRow="0" w:firstColumn="0" w:lastColumn="0" w:oddVBand="0" w:evenVBand="0" w:oddHBand="0" w:evenHBand="0" w:firstRowFirstColumn="0" w:firstRowLastColumn="0" w:lastRowFirstColumn="0" w:lastRowLastColumn="0"/>
             </w:pPr>
             <w:r>
-              <w:t>…</w:t>
+              <w:rPr>
+                <w:rFonts w:ascii="Times New Roman" w:hAnsi="Times New Roman" w:eastAsia="Times New Roman"/>
+                <w:sz w:val="14"/>
+              </w:rPr>
+              <w:t>{{ component_iii_b_score }}</w:t>
             </w:r>
           </w:p>
         </w:tc>
@@ -1433,7 +1152,11 @@
               <w:cnfStyle w:val="000000000000" w:firstRow="0" w:lastRow="0" w:firstColumn="0" w:lastColumn="0" w:oddVBand="0" w:evenVBand="0" w:oddHBand="0" w:evenHBand="0" w:firstRowFirstColumn="0" w:firstRowLastColumn="0" w:lastRowFirstColumn="0" w:lastRowLastColumn="0"/>
             </w:pPr>
             <w:r>
-              <w:t>…</w:t>
+              <w:rPr>
+                <w:rFonts w:ascii="Times New Roman" w:hAnsi="Times New Roman" w:eastAsia="Times New Roman"/>
+                <w:sz w:val="14"/>
+              </w:rPr>
+              <w:t>{{ component_iii_b_adjustment }}</w:t>
             </w:r>
           </w:p>
         </w:tc>
@@ -1452,7 +1175,11 @@
               <w:cnfStyle w:val="000000000000" w:firstRow="0" w:lastRow="0" w:firstColumn="0" w:lastColumn="0" w:oddVBand="0" w:evenVBand="0" w:oddHBand="0" w:evenHBand="0" w:firstRowFirstColumn="0" w:firstRowLastColumn="0" w:lastRowFirstColumn="0" w:lastRowLastColumn="0"/>
             </w:pPr>
             <w:r>
-              <w:t>…</w:t>
+              <w:rPr>
+                <w:rFonts w:ascii="Times New Roman" w:hAnsi="Times New Roman" w:eastAsia="Times New Roman"/>
+                <w:sz w:val="14"/>
+              </w:rPr>
+              <w:t>{{ component_iii_b_score }}</w:t>
             </w:r>
           </w:p>
         </w:tc>
@@ -1535,6 +1262,13 @@
               <w:jc w:val="center"/>
               <w:cnfStyle w:val="000000000000" w:firstRow="0" w:lastRow="0" w:firstColumn="0" w:lastColumn="0" w:oddVBand="0" w:evenVBand="0" w:oddHBand="0" w:evenHBand="0" w:firstRowFirstColumn="0" w:firstRowLastColumn="0" w:lastRowFirstColumn="0" w:lastRowLastColumn="0"/>
             </w:pPr>
+            <w:r>
+              <w:rPr>
+                <w:rFonts w:ascii="Times New Roman" w:hAnsi="Times New Roman" w:eastAsia="Times New Roman"/>
+                <w:sz w:val="14"/>
+              </w:rPr>
+              <w:t>{{ total_score }}</w:t>
+            </w:r>
           </w:p>
         </w:tc>
         <w:tc>
@@ -1551,6 +1285,13 @@
               <w:jc w:val="center"/>
               <w:cnfStyle w:val="000000000000" w:firstRow="0" w:lastRow="0" w:firstColumn="0" w:lastColumn="0" w:oddVBand="0" w:evenVBand="0" w:oddHBand="0" w:evenHBand="0" w:firstRowFirstColumn="0" w:firstRowLastColumn="0" w:lastRowFirstColumn="0" w:lastRowLastColumn="0"/>
             </w:pPr>
+            <w:r>
+              <w:rPr>
+                <w:rFonts w:ascii="Times New Roman" w:hAnsi="Times New Roman" w:eastAsia="Times New Roman"/>
+                <w:sz w:val="14"/>
+              </w:rPr>
+              <w:t>{{ total_adjustment }}</w:t>
+            </w:r>
           </w:p>
         </w:tc>
         <w:tc>
@@ -1569,15 +1310,10 @@
             </w:pPr>
             <w:r>
               <w:rPr>
-                <w:b/>
-              </w:rPr>
-              <w:t>..</w:t>
-            </w:r>
-            <w:r>
-              <w:rPr>
-                <w:b/>
-              </w:rPr>
-              <w:t>…/100</w:t>
+                <w:rFonts w:ascii="Times New Roman" w:hAnsi="Times New Roman" w:eastAsia="Times New Roman"/>
+                <w:sz w:val="14"/>
+              </w:rPr>
+              <w:t>{{ total_score }}/100</w:t>
             </w:r>
           </w:p>
         </w:tc>
@@ -1640,24 +1376,13 @@
               <w:spacing w:after="0"/>
               <w:jc w:val="center"/>
             </w:pPr>
-            <w:sdt>
-              <w:sdtPr>
-                <w:id w:val="1844516061"/>
-                <w14:checkbox>
-                  <w14:checked w14:val="0"/>
-                  <w14:checkedState w14:val="2612" w14:font="MS Gothic"/>
-                  <w14:uncheckedState w14:val="2610" w14:font="MS Gothic"/>
-                </w14:checkbox>
-              </w:sdtPr>
-              <w:sdtContent>
-                <w:r>
-                  <w:rPr>
-                    <w:rFonts w:ascii="MS Gothic" w:eastAsia="MS Gothic" w:hAnsi="MS Gothic" w:hint="eastAsia"/>
-                  </w:rPr>
-                  <w:t>☐</w:t>
-                </w:r>
-              </w:sdtContent>
-            </w:sdt>
+            <w:r>
+              <w:rPr>
+                <w:rFonts w:ascii="Times New Roman" w:hAnsi="Times New Roman" w:eastAsia="Times New Roman"/>
+                <w:sz w:val="14"/>
+              </w:rPr>
+              <w:t>{{ c_xuat_sac }}</w:t>
+            </w:r>
           </w:p>
         </w:tc>
         <w:tc>
@@ -1687,24 +1412,13 @@
               <w:spacing w:after="0"/>
               <w:jc w:val="center"/>
             </w:pPr>
-            <w:sdt>
-              <w:sdtPr>
-                <w:id w:val="-1031722713"/>
-                <w14:checkbox>
-                  <w14:checked w14:val="0"/>
-                  <w14:checkedState w14:val="2612" w14:font="MS Gothic"/>
-                  <w14:uncheckedState w14:val="2610" w14:font="MS Gothic"/>
-                </w14:checkbox>
-              </w:sdtPr>
-              <w:sdtContent>
-                <w:r>
-                  <w:rPr>
-                    <w:rFonts w:ascii="MS Gothic" w:eastAsia="MS Gothic" w:hAnsi="MS Gothic" w:hint="eastAsia"/>
-                  </w:rPr>
-                  <w:t>☐</w:t>
-                </w:r>
-              </w:sdtContent>
-            </w:sdt>
+            <w:r>
+              <w:rPr>
+                <w:rFonts w:ascii="Times New Roman" w:hAnsi="Times New Roman" w:eastAsia="Times New Roman"/>
+                <w:sz w:val="14"/>
+              </w:rPr>
+              <w:t>{{ c_tot }}</w:t>
+            </w:r>
           </w:p>
         </w:tc>
         <w:tc>
@@ -1734,24 +1448,13 @@
               <w:spacing w:after="0"/>
               <w:jc w:val="center"/>
             </w:pPr>
-            <w:sdt>
-              <w:sdtPr>
-                <w:id w:val="955065290"/>
-                <w14:checkbox>
-                  <w14:checked w14:val="0"/>
-                  <w14:checkedState w14:val="2612" w14:font="MS Gothic"/>
-                  <w14:uncheckedState w14:val="2610" w14:font="MS Gothic"/>
-                </w14:checkbox>
-              </w:sdtPr>
-              <w:sdtContent>
-                <w:r>
-                  <w:rPr>
-                    <w:rFonts w:ascii="MS Gothic" w:eastAsia="MS Gothic" w:hAnsi="MS Gothic" w:hint="eastAsia"/>
-                  </w:rPr>
-                  <w:t>☐</w:t>
-                </w:r>
-              </w:sdtContent>
-            </w:sdt>
+            <w:r>
+              <w:rPr>
+                <w:rFonts w:ascii="Times New Roman" w:hAnsi="Times New Roman" w:eastAsia="Times New Roman"/>
+                <w:sz w:val="14"/>
+              </w:rPr>
+              <w:t>{{ c_dat }}</w:t>
+            </w:r>
           </w:p>
         </w:tc>
         <w:tc>
@@ -1781,24 +1484,13 @@
               <w:spacing w:after="0"/>
               <w:jc w:val="center"/>
             </w:pPr>
-            <w:sdt>
-              <w:sdtPr>
-                <w:id w:val="1159575398"/>
-                <w14:checkbox>
-                  <w14:checked w14:val="0"/>
-                  <w14:checkedState w14:val="2612" w14:font="MS Gothic"/>
-                  <w14:uncheckedState w14:val="2610" w14:font="MS Gothic"/>
-                </w14:checkbox>
-              </w:sdtPr>
-              <w:sdtContent>
-                <w:r>
-                  <w:rPr>
-                    <w:rFonts w:ascii="MS Gothic" w:eastAsia="MS Gothic" w:hAnsi="MS Gothic" w:hint="eastAsia"/>
-                  </w:rPr>
-                  <w:t>☐</w:t>
-                </w:r>
-              </w:sdtContent>
-            </w:sdt>
+            <w:r>
+              <w:rPr>
+                <w:rFonts w:ascii="Times New Roman" w:hAnsi="Times New Roman" w:eastAsia="Times New Roman"/>
+                <w:sz w:val="14"/>
+              </w:rPr>
+              <w:t>{{ c_can_cai_thien }}</w:t>
+            </w:r>
           </w:p>
         </w:tc>
         <w:tc>
@@ -1831,24 +1523,13 @@
                 <w:rFonts w:asciiTheme="minorHAnsi" w:hAnsiTheme="minorHAnsi" w:cs="Segoe UI Symbol"/>
               </w:rPr>
             </w:pPr>
-            <w:sdt>
-              <w:sdtPr>
-                <w:id w:val="-1153136914"/>
-                <w14:checkbox>
-                  <w14:checked w14:val="0"/>
-                  <w14:checkedState w14:val="2612" w14:font="MS Gothic"/>
-                  <w14:uncheckedState w14:val="2610" w14:font="MS Gothic"/>
-                </w14:checkbox>
-              </w:sdtPr>
-              <w:sdtContent>
-                <w:r>
-                  <w:rPr>
-                    <w:rFonts w:ascii="MS Gothic" w:eastAsia="MS Gothic" w:hAnsi="MS Gothic" w:hint="eastAsia"/>
-                  </w:rPr>
-                  <w:t>☐</w:t>
-                </w:r>
-              </w:sdtContent>
-            </w:sdt>
+            <w:r>
+              <w:rPr>
+                <w:rFonts w:ascii="Times New Roman" w:hAnsi="Times New Roman" w:eastAsia="Times New Roman"/>
+                <w:sz w:val="14"/>
+              </w:rPr>
+              <w:t>{{ c_khong_dat }}</w:t>
+            </w:r>
           </w:p>
         </w:tc>
         <w:tc>
@@ -1874,6 +1555,15 @@
       </w:pPr>
       <w:r>
         <w:t>ĐIỀU KIỆN CHẶN XẾP LOẠI</w:t>
+      </w:r>
+    </w:p>
+    <w:p>
+      <w:r>
+        <w:rPr>
+          <w:rFonts w:ascii="Times New Roman" w:hAnsi="Times New Roman" w:eastAsia="Times New Roman"/>
+          <w:sz w:val="18"/>
+        </w:rPr>
+        <w:t>Tổng hợp từ hệ thống: {{ blockers_text }}</w:t>
       </w:r>
     </w:p>
     <w:tbl>
@@ -1999,60 +1689,22 @@
               <w:jc w:val="left"/>
               <w:cnfStyle w:val="000000000000" w:firstRow="0" w:lastRow="0" w:firstColumn="0" w:lastColumn="0" w:oddVBand="0" w:evenVBand="0" w:oddHBand="0" w:evenHBand="0" w:firstRowFirstColumn="0" w:firstRowLastColumn="0" w:lastRowFirstColumn="0" w:lastRowLastColumn="0"/>
             </w:pPr>
-            <w:sdt>
-              <w:sdtPr>
-                <w:id w:val="-957563916"/>
-                <w14:checkbox>
-                  <w14:checked w14:val="0"/>
-                  <w14:checkedState w14:val="2612" w14:font="MS Gothic"/>
-                  <w14:uncheckedState w14:val="2610" w14:font="MS Gothic"/>
-                </w14:checkbox>
-              </w:sdtPr>
-              <w:sdtContent>
-                <w:r>
-                  <w:rPr>
-                    <w:rFonts w:ascii="MS Gothic" w:eastAsia="MS Gothic" w:hAnsi="MS Gothic" w:hint="eastAsia"/>
-                  </w:rPr>
-                  <w:t>☐</w:t>
-                </w:r>
-              </w:sdtContent>
-            </w:sdt>
-            <w:r>
-              <w:t xml:space="preserve"> </w:t>
-            </w:r>
-            <w:r>
-              <w:t>Có</w:t>
-            </w:r>
-          </w:p>
-          <w:p>
-            <w:pPr>
-              <w:spacing w:after="0" w:line="312" w:lineRule="auto"/>
-              <w:jc w:val="left"/>
-              <w:cnfStyle w:val="000000000000" w:firstRow="0" w:lastRow="0" w:firstColumn="0" w:lastColumn="0" w:oddVBand="0" w:evenVBand="0" w:oddHBand="0" w:evenHBand="0" w:firstRowFirstColumn="0" w:firstRowLastColumn="0" w:lastRowFirstColumn="0" w:lastRowLastColumn="0"/>
-            </w:pPr>
-            <w:sdt>
-              <w:sdtPr>
-                <w:id w:val="564147449"/>
-                <w14:checkbox>
-                  <w14:checked w14:val="0"/>
-                  <w14:checkedState w14:val="2612" w14:font="MS Gothic"/>
-                  <w14:uncheckedState w14:val="2610" w14:font="MS Gothic"/>
-                </w14:checkbox>
-              </w:sdtPr>
-              <w:sdtContent>
-                <w:r>
-                  <w:rPr>
-                    <w:rFonts w:ascii="MS Gothic" w:eastAsia="MS Gothic" w:hAnsi="MS Gothic" w:hint="eastAsia"/>
-                  </w:rPr>
-                  <w:t>☐</w:t>
-                </w:r>
-              </w:sdtContent>
-            </w:sdt>
-            <w:r>
-              <w:t xml:space="preserve"> </w:t>
-            </w:r>
-            <w:r>
-              <w:t>Không</w:t>
+            <w:r>
+              <w:rPr>
+                <w:rFonts w:ascii="Times New Roman" w:hAnsi="Times New Roman" w:eastAsia="Times New Roman"/>
+                <w:sz w:val="14"/>
+              </w:rPr>
+              <w:t>{{ absent_yes }} Có</w:t>
+            </w:r>
+            <w:r>
+              <w:br/>
+            </w:r>
+            <w:r>
+              <w:rPr>
+                <w:rFonts w:ascii="Times New Roman" w:hAnsi="Times New Roman" w:eastAsia="Times New Roman"/>
+                <w:sz w:val="14"/>
+              </w:rPr>
+              <w:t>{{ absent_no }} Không</w:t>
             </w:r>
           </w:p>
         </w:tc>
@@ -2086,7 +1738,11 @@
               <w:cnfStyle w:val="000000000000" w:firstRow="0" w:lastRow="0" w:firstColumn="0" w:lastColumn="0" w:oddVBand="0" w:evenVBand="0" w:oddHBand="0" w:evenHBand="0" w:firstRowFirstColumn="0" w:firstRowLastColumn="0" w:lastRowFirstColumn="0" w:lastRowLastColumn="0"/>
             </w:pPr>
             <w:r>
-              <w:t>…</w:t>
+              <w:rPr>
+                <w:rFonts w:ascii="Times New Roman" w:hAnsi="Times New Roman" w:eastAsia="Times New Roman"/>
+                <w:sz w:val="14"/>
+              </w:rPr>
+              <w:t>{{ absent_ev }}</w:t>
             </w:r>
           </w:p>
         </w:tc>
@@ -2129,60 +1785,22 @@
               <w:jc w:val="left"/>
               <w:cnfStyle w:val="000000000000" w:firstRow="0" w:lastRow="0" w:firstColumn="0" w:lastColumn="0" w:oddVBand="0" w:evenVBand="0" w:oddHBand="0" w:evenHBand="0" w:firstRowFirstColumn="0" w:firstRowLastColumn="0" w:lastRowFirstColumn="0" w:lastRowLastColumn="0"/>
             </w:pPr>
-            <w:sdt>
-              <w:sdtPr>
-                <w:id w:val="1936327357"/>
-                <w14:checkbox>
-                  <w14:checked w14:val="0"/>
-                  <w14:checkedState w14:val="2612" w14:font="MS Gothic"/>
-                  <w14:uncheckedState w14:val="2610" w14:font="MS Gothic"/>
-                </w14:checkbox>
-              </w:sdtPr>
-              <w:sdtContent>
-                <w:r>
-                  <w:rPr>
-                    <w:rFonts w:ascii="MS Gothic" w:eastAsia="MS Gothic" w:hAnsi="MS Gothic" w:hint="eastAsia"/>
-                  </w:rPr>
-                  <w:t>☐</w:t>
-                </w:r>
-              </w:sdtContent>
-            </w:sdt>
-            <w:r>
-              <w:t xml:space="preserve"> </w:t>
-            </w:r>
-            <w:r>
-              <w:t>Có</w:t>
-            </w:r>
-          </w:p>
-          <w:p>
-            <w:pPr>
-              <w:spacing w:after="0" w:line="312" w:lineRule="auto"/>
-              <w:jc w:val="left"/>
-              <w:cnfStyle w:val="000000000000" w:firstRow="0" w:lastRow="0" w:firstColumn="0" w:lastColumn="0" w:oddVBand="0" w:evenVBand="0" w:oddHBand="0" w:evenHBand="0" w:firstRowFirstColumn="0" w:firstRowLastColumn="0" w:lastRowFirstColumn="0" w:lastRowLastColumn="0"/>
-            </w:pPr>
-            <w:sdt>
-              <w:sdtPr>
-                <w:id w:val="1555276416"/>
-                <w14:checkbox>
-                  <w14:checked w14:val="0"/>
-                  <w14:checkedState w14:val="2612" w14:font="MS Gothic"/>
-                  <w14:uncheckedState w14:val="2610" w14:font="MS Gothic"/>
-                </w14:checkbox>
-              </w:sdtPr>
-              <w:sdtContent>
-                <w:r>
-                  <w:rPr>
-                    <w:rFonts w:ascii="MS Gothic" w:eastAsia="MS Gothic" w:hAnsi="MS Gothic" w:hint="eastAsia"/>
-                  </w:rPr>
-                  <w:t>☐</w:t>
-                </w:r>
-              </w:sdtContent>
-            </w:sdt>
-            <w:r>
-              <w:t xml:space="preserve"> </w:t>
-            </w:r>
-            <w:r>
-              <w:t>Không</w:t>
+            <w:r>
+              <w:rPr>
+                <w:rFonts w:ascii="Times New Roman" w:hAnsi="Times New Roman" w:eastAsia="Times New Roman"/>
+                <w:sz w:val="14"/>
+              </w:rPr>
+              <w:t>{{ att80_yes }} Có</w:t>
+            </w:r>
+            <w:r>
+              <w:br/>
+            </w:r>
+            <w:r>
+              <w:rPr>
+                <w:rFonts w:ascii="Times New Roman" w:hAnsi="Times New Roman" w:eastAsia="Times New Roman"/>
+                <w:sz w:val="14"/>
+              </w:rPr>
+              <w:t>{{ att80_no }} Không</w:t>
             </w:r>
           </w:p>
         </w:tc>
@@ -2216,7 +1834,11 @@
               <w:cnfStyle w:val="000000000000" w:firstRow="0" w:lastRow="0" w:firstColumn="0" w:lastColumn="0" w:oddVBand="0" w:evenVBand="0" w:oddHBand="0" w:evenHBand="0" w:firstRowFirstColumn="0" w:firstRowLastColumn="0" w:lastRowFirstColumn="0" w:lastRowLastColumn="0"/>
             </w:pPr>
             <w:r>
-              <w:t>…</w:t>
+              <w:rPr>
+                <w:rFonts w:ascii="Times New Roman" w:hAnsi="Times New Roman" w:eastAsia="Times New Roman"/>
+                <w:sz w:val="14"/>
+              </w:rPr>
+              <w:t>{{ att80_ev }}</w:t>
             </w:r>
           </w:p>
         </w:tc>
@@ -2259,60 +1881,22 @@
               <w:jc w:val="left"/>
               <w:cnfStyle w:val="000000000000" w:firstRow="0" w:lastRow="0" w:firstColumn="0" w:lastColumn="0" w:oddVBand="0" w:evenVBand="0" w:oddHBand="0" w:evenHBand="0" w:firstRowFirstColumn="0" w:firstRowLastColumn="0" w:lastRowFirstColumn="0" w:lastRowLastColumn="0"/>
             </w:pPr>
-            <w:sdt>
-              <w:sdtPr>
-                <w:id w:val="-485473728"/>
-                <w14:checkbox>
-                  <w14:checked w14:val="0"/>
-                  <w14:checkedState w14:val="2612" w14:font="MS Gothic"/>
-                  <w14:uncheckedState w14:val="2610" w14:font="MS Gothic"/>
-                </w14:checkbox>
-              </w:sdtPr>
-              <w:sdtContent>
-                <w:r>
-                  <w:rPr>
-                    <w:rFonts w:ascii="MS Gothic" w:eastAsia="MS Gothic" w:hAnsi="MS Gothic" w:hint="eastAsia"/>
-                  </w:rPr>
-                  <w:t>☐</w:t>
-                </w:r>
-              </w:sdtContent>
-            </w:sdt>
-            <w:r>
-              <w:t xml:space="preserve"> </w:t>
-            </w:r>
-            <w:r>
-              <w:t>Có</w:t>
-            </w:r>
-          </w:p>
-          <w:p>
-            <w:pPr>
-              <w:spacing w:after="0" w:line="312" w:lineRule="auto"/>
-              <w:jc w:val="left"/>
-              <w:cnfStyle w:val="000000000000" w:firstRow="0" w:lastRow="0" w:firstColumn="0" w:lastColumn="0" w:oddVBand="0" w:evenVBand="0" w:oddHBand="0" w:evenHBand="0" w:firstRowFirstColumn="0" w:firstRowLastColumn="0" w:lastRowFirstColumn="0" w:lastRowLastColumn="0"/>
-            </w:pPr>
-            <w:sdt>
-              <w:sdtPr>
-                <w:id w:val="-510369402"/>
-                <w14:checkbox>
-                  <w14:checked w14:val="0"/>
-                  <w14:checkedState w14:val="2612" w14:font="MS Gothic"/>
-                  <w14:uncheckedState w14:val="2610" w14:font="MS Gothic"/>
-                </w14:checkbox>
-              </w:sdtPr>
-              <w:sdtContent>
-                <w:r>
-                  <w:rPr>
-                    <w:rFonts w:ascii="MS Gothic" w:eastAsia="MS Gothic" w:hAnsi="MS Gothic" w:hint="eastAsia"/>
-                  </w:rPr>
-                  <w:t>☐</w:t>
-                </w:r>
-              </w:sdtContent>
-            </w:sdt>
-            <w:r>
-              <w:t xml:space="preserve"> </w:t>
-            </w:r>
-            <w:r>
-              <w:t>Không</w:t>
+            <w:r>
+              <w:rPr>
+                <w:rFonts w:ascii="Times New Roman" w:hAnsi="Times New Roman" w:eastAsia="Times New Roman"/>
+                <w:sz w:val="14"/>
+              </w:rPr>
+              <w:t>{{ incomplete_yes }} Có</w:t>
+            </w:r>
+            <w:r>
+              <w:br/>
+            </w:r>
+            <w:r>
+              <w:rPr>
+                <w:rFonts w:ascii="Times New Roman" w:hAnsi="Times New Roman" w:eastAsia="Times New Roman"/>
+                <w:sz w:val="14"/>
+              </w:rPr>
+              <w:t>{{ incomplete_no }} Không</w:t>
             </w:r>
           </w:p>
         </w:tc>
@@ -2346,7 +1930,11 @@
               <w:cnfStyle w:val="000000000000" w:firstRow="0" w:lastRow="0" w:firstColumn="0" w:lastColumn="0" w:oddVBand="0" w:evenVBand="0" w:oddHBand="0" w:evenHBand="0" w:firstRowFirstColumn="0" w:firstRowLastColumn="0" w:lastRowFirstColumn="0" w:lastRowLastColumn="0"/>
             </w:pPr>
             <w:r>
-              <w:t>…</w:t>
+              <w:rPr>
+                <w:rFonts w:ascii="Times New Roman" w:hAnsi="Times New Roman" w:eastAsia="Times New Roman"/>
+                <w:sz w:val="14"/>
+              </w:rPr>
+              <w:t>{{ incomplete_ev }}</w:t>
             </w:r>
           </w:p>
         </w:tc>
@@ -2389,60 +1977,22 @@
               <w:jc w:val="left"/>
               <w:cnfStyle w:val="000000000000" w:firstRow="0" w:lastRow="0" w:firstColumn="0" w:lastColumn="0" w:oddVBand="0" w:evenVBand="0" w:oddHBand="0" w:evenHBand="0" w:firstRowFirstColumn="0" w:firstRowLastColumn="0" w:lastRowFirstColumn="0" w:lastRowLastColumn="0"/>
             </w:pPr>
-            <w:sdt>
-              <w:sdtPr>
-                <w:id w:val="-215969452"/>
-                <w14:checkbox>
-                  <w14:checked w14:val="0"/>
-                  <w14:checkedState w14:val="2612" w14:font="MS Gothic"/>
-                  <w14:uncheckedState w14:val="2610" w14:font="MS Gothic"/>
-                </w14:checkbox>
-              </w:sdtPr>
-              <w:sdtContent>
-                <w:r>
-                  <w:rPr>
-                    <w:rFonts w:ascii="MS Gothic" w:eastAsia="MS Gothic" w:hAnsi="MS Gothic" w:hint="eastAsia"/>
-                  </w:rPr>
-                  <w:t>☐</w:t>
-                </w:r>
-              </w:sdtContent>
-            </w:sdt>
-            <w:r>
-              <w:t xml:space="preserve"> </w:t>
-            </w:r>
-            <w:r>
-              <w:t>Có</w:t>
-            </w:r>
-          </w:p>
-          <w:p>
-            <w:pPr>
-              <w:spacing w:after="0" w:line="312" w:lineRule="auto"/>
-              <w:jc w:val="left"/>
-              <w:cnfStyle w:val="000000000000" w:firstRow="0" w:lastRow="0" w:firstColumn="0" w:lastColumn="0" w:oddVBand="0" w:evenVBand="0" w:oddHBand="0" w:evenHBand="0" w:firstRowFirstColumn="0" w:firstRowLastColumn="0" w:lastRowFirstColumn="0" w:lastRowLastColumn="0"/>
-            </w:pPr>
-            <w:sdt>
-              <w:sdtPr>
-                <w:id w:val="-1266847370"/>
-                <w14:checkbox>
-                  <w14:checked w14:val="0"/>
-                  <w14:checkedState w14:val="2612" w14:font="MS Gothic"/>
-                  <w14:uncheckedState w14:val="2610" w14:font="MS Gothic"/>
-                </w14:checkbox>
-              </w:sdtPr>
-              <w:sdtContent>
-                <w:r>
-                  <w:rPr>
-                    <w:rFonts w:ascii="MS Gothic" w:eastAsia="MS Gothic" w:hAnsi="MS Gothic" w:hint="eastAsia"/>
-                  </w:rPr>
-                  <w:t>☐</w:t>
-                </w:r>
-              </w:sdtContent>
-            </w:sdt>
-            <w:r>
-              <w:t xml:space="preserve"> </w:t>
-            </w:r>
-            <w:r>
-              <w:t>Không</w:t>
+            <w:r>
+              <w:rPr>
+                <w:rFonts w:ascii="Times New Roman" w:hAnsi="Times New Roman" w:eastAsia="Times New Roman"/>
+                <w:sz w:val="14"/>
+              </w:rPr>
+              <w:t>{{ late_yes }} Có</w:t>
+            </w:r>
+            <w:r>
+              <w:br/>
+            </w:r>
+            <w:r>
+              <w:rPr>
+                <w:rFonts w:ascii="Times New Roman" w:hAnsi="Times New Roman" w:eastAsia="Times New Roman"/>
+                <w:sz w:val="14"/>
+              </w:rPr>
+              <w:t>{{ late_no }} Không</w:t>
             </w:r>
           </w:p>
         </w:tc>
@@ -2476,7 +2026,11 @@
               <w:cnfStyle w:val="000000000000" w:firstRow="0" w:lastRow="0" w:firstColumn="0" w:lastColumn="0" w:oddVBand="0" w:evenVBand="0" w:oddHBand="0" w:evenHBand="0" w:firstRowFirstColumn="0" w:firstRowLastColumn="0" w:lastRowFirstColumn="0" w:lastRowLastColumn="0"/>
             </w:pPr>
             <w:r>
-              <w:t>…</w:t>
+              <w:rPr>
+                <w:rFonts w:ascii="Times New Roman" w:hAnsi="Times New Roman" w:eastAsia="Times New Roman"/>
+                <w:sz w:val="14"/>
+              </w:rPr>
+              <w:t>{{ late_ev }}</w:t>
             </w:r>
           </w:p>
         </w:tc>
@@ -2519,60 +2073,22 @@
               <w:jc w:val="left"/>
               <w:cnfStyle w:val="000000000000" w:firstRow="0" w:lastRow="0" w:firstColumn="0" w:lastColumn="0" w:oddVBand="0" w:evenVBand="0" w:oddHBand="0" w:evenHBand="0" w:firstRowFirstColumn="0" w:firstRowLastColumn="0" w:lastRowFirstColumn="0" w:lastRowLastColumn="0"/>
             </w:pPr>
-            <w:sdt>
-              <w:sdtPr>
-                <w:id w:val="-1142730741"/>
-                <w14:checkbox>
-                  <w14:checked w14:val="0"/>
-                  <w14:checkedState w14:val="2612" w14:font="MS Gothic"/>
-                  <w14:uncheckedState w14:val="2610" w14:font="MS Gothic"/>
-                </w14:checkbox>
-              </w:sdtPr>
-              <w:sdtContent>
-                <w:r>
-                  <w:rPr>
-                    <w:rFonts w:ascii="MS Gothic" w:eastAsia="MS Gothic" w:hAnsi="MS Gothic" w:hint="eastAsia"/>
-                  </w:rPr>
-                  <w:t>☐</w:t>
-                </w:r>
-              </w:sdtContent>
-            </w:sdt>
-            <w:r>
-              <w:t xml:space="preserve"> </w:t>
-            </w:r>
-            <w:r>
-              <w:t>Có</w:t>
-            </w:r>
-          </w:p>
-          <w:p>
-            <w:pPr>
-              <w:spacing w:after="0" w:line="312" w:lineRule="auto"/>
-              <w:jc w:val="left"/>
-              <w:cnfStyle w:val="000000000000" w:firstRow="0" w:lastRow="0" w:firstColumn="0" w:lastColumn="0" w:oddVBand="0" w:evenVBand="0" w:oddHBand="0" w:evenHBand="0" w:firstRowFirstColumn="0" w:firstRowLastColumn="0" w:lastRowFirstColumn="0" w:lastRowLastColumn="0"/>
-            </w:pPr>
-            <w:sdt>
-              <w:sdtPr>
-                <w:id w:val="-12230045"/>
-                <w14:checkbox>
-                  <w14:checked w14:val="0"/>
-                  <w14:checkedState w14:val="2612" w14:font="MS Gothic"/>
-                  <w14:uncheckedState w14:val="2610" w14:font="MS Gothic"/>
-                </w14:checkbox>
-              </w:sdtPr>
-              <w:sdtContent>
-                <w:r>
-                  <w:rPr>
-                    <w:rFonts w:ascii="MS Gothic" w:eastAsia="MS Gothic" w:hAnsi="MS Gothic" w:hint="eastAsia"/>
-                  </w:rPr>
-                  <w:t>☐</w:t>
-                </w:r>
-              </w:sdtContent>
-            </w:sdt>
-            <w:r>
-              <w:t xml:space="preserve"> </w:t>
-            </w:r>
-            <w:r>
-              <w:t>Không</w:t>
+            <w:r>
+              <w:rPr>
+                <w:rFonts w:ascii="Times New Roman" w:hAnsi="Times New Roman" w:eastAsia="Times New Roman"/>
+                <w:sz w:val="14"/>
+              </w:rPr>
+              <w:t>{{ warning_yes }} Có</w:t>
+            </w:r>
+            <w:r>
+              <w:br/>
+            </w:r>
+            <w:r>
+              <w:rPr>
+                <w:rFonts w:ascii="Times New Roman" w:hAnsi="Times New Roman" w:eastAsia="Times New Roman"/>
+                <w:sz w:val="14"/>
+              </w:rPr>
+              <w:t>{{ warning_no }} Không</w:t>
             </w:r>
           </w:p>
         </w:tc>
@@ -2606,7 +2122,11 @@
               <w:cnfStyle w:val="000000000000" w:firstRow="0" w:lastRow="0" w:firstColumn="0" w:lastColumn="0" w:oddVBand="0" w:evenVBand="0" w:oddHBand="0" w:evenHBand="0" w:firstRowFirstColumn="0" w:firstRowLastColumn="0" w:lastRowFirstColumn="0" w:lastRowLastColumn="0"/>
             </w:pPr>
             <w:r>
-              <w:t>…</w:t>
+              <w:rPr>
+                <w:rFonts w:ascii="Times New Roman" w:hAnsi="Times New Roman" w:eastAsia="Times New Roman"/>
+                <w:sz w:val="14"/>
+              </w:rPr>
+              <w:t>{{ warning_ev }}</w:t>
             </w:r>
           </w:p>
         </w:tc>
@@ -2649,60 +2169,22 @@
               <w:jc w:val="left"/>
               <w:cnfStyle w:val="000000000000" w:firstRow="0" w:lastRow="0" w:firstColumn="0" w:lastColumn="0" w:oddVBand="0" w:evenVBand="0" w:oddHBand="0" w:evenHBand="0" w:firstRowFirstColumn="0" w:firstRowLastColumn="0" w:lastRowFirstColumn="0" w:lastRowLastColumn="0"/>
             </w:pPr>
-            <w:sdt>
-              <w:sdtPr>
-                <w:id w:val="-787358988"/>
-                <w14:checkbox>
-                  <w14:checked w14:val="0"/>
-                  <w14:checkedState w14:val="2612" w14:font="MS Gothic"/>
-                  <w14:uncheckedState w14:val="2610" w14:font="MS Gothic"/>
-                </w14:checkbox>
-              </w:sdtPr>
-              <w:sdtContent>
-                <w:r>
-                  <w:rPr>
-                    <w:rFonts w:ascii="MS Gothic" w:eastAsia="MS Gothic" w:hAnsi="MS Gothic" w:hint="eastAsia"/>
-                  </w:rPr>
-                  <w:t>☐</w:t>
-                </w:r>
-              </w:sdtContent>
-            </w:sdt>
-            <w:r>
-              <w:t xml:space="preserve"> </w:t>
-            </w:r>
-            <w:r>
-              <w:t>Có</w:t>
-            </w:r>
-          </w:p>
-          <w:p>
-            <w:pPr>
-              <w:spacing w:after="0" w:line="312" w:lineRule="auto"/>
-              <w:jc w:val="left"/>
-              <w:cnfStyle w:val="000000000000" w:firstRow="0" w:lastRow="0" w:firstColumn="0" w:lastColumn="0" w:oddVBand="0" w:evenVBand="0" w:oddHBand="0" w:evenHBand="0" w:firstRowFirstColumn="0" w:firstRowLastColumn="0" w:lastRowFirstColumn="0" w:lastRowLastColumn="0"/>
-            </w:pPr>
-            <w:sdt>
-              <w:sdtPr>
-                <w:id w:val="623589944"/>
-                <w14:checkbox>
-                  <w14:checked w14:val="0"/>
-                  <w14:checkedState w14:val="2612" w14:font="MS Gothic"/>
-                  <w14:uncheckedState w14:val="2610" w14:font="MS Gothic"/>
-                </w14:checkbox>
-              </w:sdtPr>
-              <w:sdtContent>
-                <w:r>
-                  <w:rPr>
-                    <w:rFonts w:ascii="MS Gothic" w:eastAsia="MS Gothic" w:hAnsi="MS Gothic" w:hint="eastAsia"/>
-                  </w:rPr>
-                  <w:t>☐</w:t>
-                </w:r>
-              </w:sdtContent>
-            </w:sdt>
-            <w:r>
-              <w:t xml:space="preserve"> </w:t>
-            </w:r>
-            <w:r>
-              <w:t>Không</w:t>
+            <w:r>
+              <w:rPr>
+                <w:rFonts w:ascii="Times New Roman" w:hAnsi="Times New Roman" w:eastAsia="Times New Roman"/>
+                <w:sz w:val="14"/>
+              </w:rPr>
+              <w:t>{{ severe_yes }} Có</w:t>
+            </w:r>
+            <w:r>
+              <w:br/>
+            </w:r>
+            <w:r>
+              <w:rPr>
+                <w:rFonts w:ascii="Times New Roman" w:hAnsi="Times New Roman" w:eastAsia="Times New Roman"/>
+                <w:sz w:val="14"/>
+              </w:rPr>
+              <w:t>{{ severe_no }} Không</w:t>
             </w:r>
           </w:p>
         </w:tc>
@@ -2736,7 +2218,11 @@
               <w:cnfStyle w:val="000000000000" w:firstRow="0" w:lastRow="0" w:firstColumn="0" w:lastColumn="0" w:oddVBand="0" w:evenVBand="0" w:oddHBand="0" w:evenHBand="0" w:firstRowFirstColumn="0" w:firstRowLastColumn="0" w:lastRowFirstColumn="0" w:lastRowLastColumn="0"/>
             </w:pPr>
             <w:r>
-              <w:t>…</w:t>
+              <w:rPr>
+                <w:rFonts w:ascii="Times New Roman" w:hAnsi="Times New Roman" w:eastAsia="Times New Roman"/>
+                <w:sz w:val="14"/>
+              </w:rPr>
+              <w:t>{{ severe_ev }}</w:t>
             </w:r>
           </w:p>
         </w:tc>
@@ -2755,7 +2241,21 @@
         <w:pStyle w:val="Heading2"/>
       </w:pPr>
       <w:r>
+        <w:rPr>
+          <w:rFonts w:ascii="Times New Roman" w:hAnsi="Times New Roman" w:eastAsia="Times New Roman"/>
+          <w:sz w:val="20"/>
+        </w:rPr>
         <w:t>Điểm mạnh</w:t>
+      </w:r>
+      <w:r>
+        <w:br/>
+      </w:r>
+      <w:r>
+        <w:rPr>
+          <w:rFonts w:ascii="Times New Roman" w:hAnsi="Times New Roman" w:eastAsia="Times New Roman"/>
+          <w:sz w:val="20"/>
+        </w:rPr>
+        <w:t>{{ strengths_text }}</w:t>
       </w:r>
     </w:p>
     <w:p>
@@ -2793,7 +2293,21 @@
         <w:pStyle w:val="Heading2"/>
       </w:pPr>
       <w:r>
+        <w:rPr>
+          <w:rFonts w:ascii="Times New Roman" w:hAnsi="Times New Roman" w:eastAsia="Times New Roman"/>
+          <w:sz w:val="20"/>
+        </w:rPr>
         <w:t>Hạn chế cải thiện</w:t>
+      </w:r>
+      <w:r>
+        <w:br/>
+      </w:r>
+      <w:r>
+        <w:rPr>
+          <w:rFonts w:ascii="Times New Roman" w:hAnsi="Times New Roman" w:eastAsia="Times New Roman"/>
+          <w:sz w:val="20"/>
+        </w:rPr>
+        <w:t>{{ improvement_text }}</w:t>
       </w:r>
     </w:p>
     <w:p>
@@ -2898,6 +2412,12 @@
               <w:jc w:val="left"/>
             </w:pPr>
             <w:r>
+              <w:rPr>
+                <w:rFonts w:ascii="Times New Roman" w:hAnsi="Times New Roman" w:eastAsia="Times New Roman"/>
+                <w:sz w:val="18"/>
+              </w:rPr>
+              <w:t>{{ rec_keep }}</w:t>
+              <w:tab/>
               <w:t>Tiếp tục duy trì nhiệm vụ hiện tại</w:t>
             </w:r>
           </w:p>
@@ -2947,6 +2467,12 @@
               <w:jc w:val="left"/>
             </w:pPr>
             <w:r>
+              <w:rPr>
+                <w:rFonts w:ascii="Times New Roman" w:hAnsi="Times New Roman" w:eastAsia="Times New Roman"/>
+                <w:sz w:val="18"/>
+              </w:rPr>
+              <w:t>{{ rec_more_task }}</w:t>
+              <w:tab/>
               <w:t>Giao thêm nhiệm vụ chuyên môn</w:t>
             </w:r>
           </w:p>
@@ -2996,6 +2522,12 @@
               <w:jc w:val="left"/>
             </w:pPr>
             <w:r>
+              <w:rPr>
+                <w:rFonts w:ascii="Times New Roman" w:hAnsi="Times New Roman" w:eastAsia="Times New Roman"/>
+                <w:sz w:val="18"/>
+              </w:rPr>
+              <w:t>{{ rec_reward }}</w:t>
+              <w:tab/>
               <w:t>Đề xuất khen thưởng</w:t>
             </w:r>
           </w:p>
@@ -3045,6 +2577,12 @@
               <w:jc w:val="left"/>
             </w:pPr>
             <w:r>
+              <w:rPr>
+                <w:rFonts w:ascii="Times New Roman" w:hAnsi="Times New Roman" w:eastAsia="Times New Roman"/>
+                <w:sz w:val="18"/>
+              </w:rPr>
+              <w:t>{{ rec_remind }}</w:t>
+              <w:tab/>
               <w:t>Đề xuất nhắc nhở</w:t>
             </w:r>
           </w:p>
@@ -3094,6 +2632,12 @@
               <w:jc w:val="left"/>
             </w:pPr>
             <w:r>
+              <w:rPr>
+                <w:rFonts w:ascii="Times New Roman" w:hAnsi="Times New Roman" w:eastAsia="Times New Roman"/>
+                <w:sz w:val="18"/>
+              </w:rPr>
+              <w:t>{{ rec_plan }}</w:t>
+              <w:tab/>
               <w:t>Đề xuất kế hoạch cải thiện cá nhân</w:t>
             </w:r>
           </w:p>
@@ -3143,6 +2687,12 @@
               <w:jc w:val="left"/>
             </w:pPr>
             <w:r>
+              <w:rPr>
+                <w:rFonts w:ascii="Times New Roman" w:hAnsi="Times New Roman" w:eastAsia="Times New Roman"/>
+                <w:sz w:val="18"/>
+              </w:rPr>
+              <w:t>{{ rec_discipline }}</w:t>
+              <w:tab/>
               <w:t>Đề xuất xem xét kỷ luật</w:t>
             </w:r>
           </w:p>
@@ -3192,7 +2742,13 @@
               <w:jc w:val="left"/>
             </w:pPr>
             <w:r>
-              <w:t>Khác: …………………………………………………</w:t>
+              <w:rPr>
+                <w:rFonts w:ascii="Times New Roman" w:hAnsi="Times New Roman" w:eastAsia="Times New Roman"/>
+                <w:sz w:val="18"/>
+              </w:rPr>
+              <w:t>{{ rec_other }}</w:t>
+              <w:tab/>
+              <w:t>Khác: {{ rec_other_text }}</w:t>
             </w:r>
           </w:p>
         </w:tc>
@@ -3203,7 +2759,21 @@
         <w:pStyle w:val="Heading2"/>
       </w:pPr>
       <w:r>
+        <w:rPr>
+          <w:rFonts w:ascii="Times New Roman" w:hAnsi="Times New Roman" w:eastAsia="Times New Roman"/>
+          <w:sz w:val="20"/>
+        </w:rPr>
         <w:t>Nội dung đề xuất cụ thể:</w:t>
+      </w:r>
+      <w:r>
+        <w:br/>
+      </w:r>
+      <w:r>
+        <w:rPr>
+          <w:rFonts w:ascii="Times New Roman" w:hAnsi="Times New Roman" w:eastAsia="Times New Roman"/>
+          <w:sz w:val="20"/>
+        </w:rPr>
+        <w:t>{{ recommendation_detail }}</w:t>
       </w:r>
     </w:p>
     <w:p>
@@ -3361,75 +2931,95 @@
               <w:jc w:val="center"/>
             </w:pPr>
             <w:r>
-              <w:t>………………………</w:t>
-            </w:r>
-          </w:p>
-        </w:tc>
-        <w:tc>
-          <w:tcPr>
-            <w:tcW w:w="0" w:type="auto"/>
-            <w:vAlign w:val="center"/>
-            <w:hideMark/>
-          </w:tcPr>
-          <w:p>
-            <w:pPr>
-              <w:spacing w:after="0" w:line="312" w:lineRule="auto"/>
-              <w:jc w:val="center"/>
-              <w:cnfStyle w:val="000000000000" w:firstRow="0" w:lastRow="0" w:firstColumn="0" w:lastColumn="0" w:oddVBand="0" w:evenVBand="0" w:oddHBand="0" w:evenHBand="0" w:firstRowFirstColumn="0" w:firstRowLastColumn="0" w:lastRowFirstColumn="0" w:lastRowLastColumn="0"/>
-            </w:pPr>
-            <w:r>
-              <w:t>………………………</w:t>
-            </w:r>
-          </w:p>
-        </w:tc>
-        <w:tc>
-          <w:tcPr>
-            <w:tcW w:w="0" w:type="auto"/>
-            <w:vAlign w:val="center"/>
-            <w:hideMark/>
-          </w:tcPr>
-          <w:p>
-            <w:pPr>
-              <w:spacing w:after="0" w:line="312" w:lineRule="auto"/>
-              <w:jc w:val="center"/>
-              <w:cnfStyle w:val="000000000000" w:firstRow="0" w:lastRow="0" w:firstColumn="0" w:lastColumn="0" w:oddVBand="0" w:evenVBand="0" w:oddHBand="0" w:evenHBand="0" w:firstRowFirstColumn="0" w:firstRowLastColumn="0" w:lastRowFirstColumn="0" w:lastRowLastColumn="0"/>
-            </w:pPr>
-            <w:r>
-              <w:t>………………………</w:t>
-            </w:r>
-          </w:p>
-        </w:tc>
-        <w:tc>
-          <w:tcPr>
-            <w:tcW w:w="0" w:type="auto"/>
-            <w:vAlign w:val="center"/>
-            <w:hideMark/>
-          </w:tcPr>
-          <w:p>
-            <w:pPr>
-              <w:spacing w:after="0" w:line="312" w:lineRule="auto"/>
-              <w:jc w:val="center"/>
-              <w:cnfStyle w:val="000000000000" w:firstRow="0" w:lastRow="0" w:firstColumn="0" w:lastColumn="0" w:oddVBand="0" w:evenVBand="0" w:oddHBand="0" w:evenHBand="0" w:firstRowFirstColumn="0" w:firstRowLastColumn="0" w:lastRowFirstColumn="0" w:lastRowLastColumn="0"/>
-            </w:pPr>
-            <w:r>
-              <w:t>…../…../2026</w:t>
-            </w:r>
-          </w:p>
-        </w:tc>
-        <w:tc>
-          <w:tcPr>
-            <w:tcW w:w="0" w:type="auto"/>
-            <w:vAlign w:val="center"/>
-            <w:hideMark/>
-          </w:tcPr>
-          <w:p>
-            <w:pPr>
-              <w:spacing w:after="0" w:line="312" w:lineRule="auto"/>
-              <w:jc w:val="center"/>
-              <w:cnfStyle w:val="000000000000" w:firstRow="0" w:lastRow="0" w:firstColumn="0" w:lastColumn="0" w:oddVBand="0" w:evenVBand="0" w:oddHBand="0" w:evenHBand="0" w:firstRowFirstColumn="0" w:firstRowLastColumn="0" w:lastRowFirstColumn="0" w:lastRowLastColumn="0"/>
-            </w:pPr>
-            <w:r>
-              <w:t>………………………</w:t>
+              <w:rPr>
+                <w:rFonts w:ascii="Times New Roman" w:hAnsi="Times New Roman" w:eastAsia="Times New Roman"/>
+                <w:sz w:val="14"/>
+              </w:rPr>
+              <w:t>{{ plan_1_content }}</w:t>
+            </w:r>
+          </w:p>
+        </w:tc>
+        <w:tc>
+          <w:tcPr>
+            <w:tcW w:w="0" w:type="auto"/>
+            <w:vAlign w:val="center"/>
+            <w:hideMark/>
+          </w:tcPr>
+          <w:p>
+            <w:pPr>
+              <w:spacing w:after="0" w:line="312" w:lineRule="auto"/>
+              <w:jc w:val="center"/>
+              <w:cnfStyle w:val="000000000000" w:firstRow="0" w:lastRow="0" w:firstColumn="0" w:lastColumn="0" w:oddVBand="0" w:evenVBand="0" w:oddHBand="0" w:evenHBand="0" w:firstRowFirstColumn="0" w:firstRowLastColumn="0" w:lastRowFirstColumn="0" w:lastRowLastColumn="0"/>
+            </w:pPr>
+            <w:r>
+              <w:rPr>
+                <w:rFonts w:ascii="Times New Roman" w:hAnsi="Times New Roman" w:eastAsia="Times New Roman"/>
+                <w:sz w:val="14"/>
+              </w:rPr>
+              <w:t>{{ plan_1_target }}</w:t>
+            </w:r>
+          </w:p>
+        </w:tc>
+        <w:tc>
+          <w:tcPr>
+            <w:tcW w:w="0" w:type="auto"/>
+            <w:vAlign w:val="center"/>
+            <w:hideMark/>
+          </w:tcPr>
+          <w:p>
+            <w:pPr>
+              <w:spacing w:after="0" w:line="312" w:lineRule="auto"/>
+              <w:jc w:val="center"/>
+              <w:cnfStyle w:val="000000000000" w:firstRow="0" w:lastRow="0" w:firstColumn="0" w:lastColumn="0" w:oddVBand="0" w:evenVBand="0" w:oddHBand="0" w:evenHBand="0" w:firstRowFirstColumn="0" w:firstRowLastColumn="0" w:lastRowFirstColumn="0" w:lastRowLastColumn="0"/>
+            </w:pPr>
+            <w:r>
+              <w:rPr>
+                <w:rFonts w:ascii="Times New Roman" w:hAnsi="Times New Roman" w:eastAsia="Times New Roman"/>
+                <w:sz w:val="14"/>
+              </w:rPr>
+              <w:t>{{ plan_1_owner }}</w:t>
+            </w:r>
+          </w:p>
+        </w:tc>
+        <w:tc>
+          <w:tcPr>
+            <w:tcW w:w="0" w:type="auto"/>
+            <w:vAlign w:val="center"/>
+            <w:hideMark/>
+          </w:tcPr>
+          <w:p>
+            <w:pPr>
+              <w:spacing w:after="0" w:line="312" w:lineRule="auto"/>
+              <w:jc w:val="center"/>
+              <w:cnfStyle w:val="000000000000" w:firstRow="0" w:lastRow="0" w:firstColumn="0" w:lastColumn="0" w:oddVBand="0" w:evenVBand="0" w:oddHBand="0" w:evenHBand="0" w:firstRowFirstColumn="0" w:firstRowLastColumn="0" w:lastRowFirstColumn="0" w:lastRowLastColumn="0"/>
+            </w:pPr>
+            <w:r>
+              <w:rPr>
+                <w:rFonts w:ascii="Times New Roman" w:hAnsi="Times New Roman" w:eastAsia="Times New Roman"/>
+                <w:sz w:val="14"/>
+              </w:rPr>
+              <w:t>{{ plan_1_deadline }}</w:t>
+            </w:r>
+          </w:p>
+        </w:tc>
+        <w:tc>
+          <w:tcPr>
+            <w:tcW w:w="0" w:type="auto"/>
+            <w:vAlign w:val="center"/>
+            <w:hideMark/>
+          </w:tcPr>
+          <w:p>
+            <w:pPr>
+              <w:spacing w:after="0" w:line="312" w:lineRule="auto"/>
+              <w:jc w:val="center"/>
+              <w:cnfStyle w:val="000000000000" w:firstRow="0" w:lastRow="0" w:firstColumn="0" w:lastColumn="0" w:oddVBand="0" w:evenVBand="0" w:oddHBand="0" w:evenHBand="0" w:firstRowFirstColumn="0" w:firstRowLastColumn="0" w:lastRowFirstColumn="0" w:lastRowLastColumn="0"/>
+            </w:pPr>
+            <w:r>
+              <w:rPr>
+                <w:rFonts w:ascii="Times New Roman" w:hAnsi="Times New Roman" w:eastAsia="Times New Roman"/>
+                <w:sz w:val="14"/>
+              </w:rPr>
+              <w:t>{{ plan_1_evidence }}</w:t>
             </w:r>
           </w:p>
         </w:tc>
@@ -3448,75 +3038,95 @@
               <w:jc w:val="center"/>
             </w:pPr>
             <w:r>
-              <w:t>………………………</w:t>
-            </w:r>
-          </w:p>
-        </w:tc>
-        <w:tc>
-          <w:tcPr>
-            <w:tcW w:w="0" w:type="auto"/>
-            <w:vAlign w:val="center"/>
-            <w:hideMark/>
-          </w:tcPr>
-          <w:p>
-            <w:pPr>
-              <w:spacing w:after="0" w:line="312" w:lineRule="auto"/>
-              <w:jc w:val="center"/>
-              <w:cnfStyle w:val="000000000000" w:firstRow="0" w:lastRow="0" w:firstColumn="0" w:lastColumn="0" w:oddVBand="0" w:evenVBand="0" w:oddHBand="0" w:evenHBand="0" w:firstRowFirstColumn="0" w:firstRowLastColumn="0" w:lastRowFirstColumn="0" w:lastRowLastColumn="0"/>
-            </w:pPr>
-            <w:r>
-              <w:t>………………………</w:t>
-            </w:r>
-          </w:p>
-        </w:tc>
-        <w:tc>
-          <w:tcPr>
-            <w:tcW w:w="0" w:type="auto"/>
-            <w:vAlign w:val="center"/>
-            <w:hideMark/>
-          </w:tcPr>
-          <w:p>
-            <w:pPr>
-              <w:spacing w:after="0" w:line="312" w:lineRule="auto"/>
-              <w:jc w:val="center"/>
-              <w:cnfStyle w:val="000000000000" w:firstRow="0" w:lastRow="0" w:firstColumn="0" w:lastColumn="0" w:oddVBand="0" w:evenVBand="0" w:oddHBand="0" w:evenHBand="0" w:firstRowFirstColumn="0" w:firstRowLastColumn="0" w:lastRowFirstColumn="0" w:lastRowLastColumn="0"/>
-            </w:pPr>
-            <w:r>
-              <w:t>………………………</w:t>
-            </w:r>
-          </w:p>
-        </w:tc>
-        <w:tc>
-          <w:tcPr>
-            <w:tcW w:w="0" w:type="auto"/>
-            <w:vAlign w:val="center"/>
-            <w:hideMark/>
-          </w:tcPr>
-          <w:p>
-            <w:pPr>
-              <w:spacing w:after="0" w:line="312" w:lineRule="auto"/>
-              <w:jc w:val="center"/>
-              <w:cnfStyle w:val="000000000000" w:firstRow="0" w:lastRow="0" w:firstColumn="0" w:lastColumn="0" w:oddVBand="0" w:evenVBand="0" w:oddHBand="0" w:evenHBand="0" w:firstRowFirstColumn="0" w:firstRowLastColumn="0" w:lastRowFirstColumn="0" w:lastRowLastColumn="0"/>
-            </w:pPr>
-            <w:r>
-              <w:t>…../…../2026</w:t>
-            </w:r>
-          </w:p>
-        </w:tc>
-        <w:tc>
-          <w:tcPr>
-            <w:tcW w:w="0" w:type="auto"/>
-            <w:vAlign w:val="center"/>
-            <w:hideMark/>
-          </w:tcPr>
-          <w:p>
-            <w:pPr>
-              <w:spacing w:after="0" w:line="312" w:lineRule="auto"/>
-              <w:jc w:val="center"/>
-              <w:cnfStyle w:val="000000000000" w:firstRow="0" w:lastRow="0" w:firstColumn="0" w:lastColumn="0" w:oddVBand="0" w:evenVBand="0" w:oddHBand="0" w:evenHBand="0" w:firstRowFirstColumn="0" w:firstRowLastColumn="0" w:lastRowFirstColumn="0" w:lastRowLastColumn="0"/>
-            </w:pPr>
-            <w:r>
-              <w:t>………………………</w:t>
+              <w:rPr>
+                <w:rFonts w:ascii="Times New Roman" w:hAnsi="Times New Roman" w:eastAsia="Times New Roman"/>
+                <w:sz w:val="14"/>
+              </w:rPr>
+              <w:t>{{ plan_2_content }}</w:t>
+            </w:r>
+          </w:p>
+        </w:tc>
+        <w:tc>
+          <w:tcPr>
+            <w:tcW w:w="0" w:type="auto"/>
+            <w:vAlign w:val="center"/>
+            <w:hideMark/>
+          </w:tcPr>
+          <w:p>
+            <w:pPr>
+              <w:spacing w:after="0" w:line="312" w:lineRule="auto"/>
+              <w:jc w:val="center"/>
+              <w:cnfStyle w:val="000000000000" w:firstRow="0" w:lastRow="0" w:firstColumn="0" w:lastColumn="0" w:oddVBand="0" w:evenVBand="0" w:oddHBand="0" w:evenHBand="0" w:firstRowFirstColumn="0" w:firstRowLastColumn="0" w:lastRowFirstColumn="0" w:lastRowLastColumn="0"/>
+            </w:pPr>
+            <w:r>
+              <w:rPr>
+                <w:rFonts w:ascii="Times New Roman" w:hAnsi="Times New Roman" w:eastAsia="Times New Roman"/>
+                <w:sz w:val="14"/>
+              </w:rPr>
+              <w:t>{{ plan_2_target }}</w:t>
+            </w:r>
+          </w:p>
+        </w:tc>
+        <w:tc>
+          <w:tcPr>
+            <w:tcW w:w="0" w:type="auto"/>
+            <w:vAlign w:val="center"/>
+            <w:hideMark/>
+          </w:tcPr>
+          <w:p>
+            <w:pPr>
+              <w:spacing w:after="0" w:line="312" w:lineRule="auto"/>
+              <w:jc w:val="center"/>
+              <w:cnfStyle w:val="000000000000" w:firstRow="0" w:lastRow="0" w:firstColumn="0" w:lastColumn="0" w:oddVBand="0" w:evenVBand="0" w:oddHBand="0" w:evenHBand="0" w:firstRowFirstColumn="0" w:firstRowLastColumn="0" w:lastRowFirstColumn="0" w:lastRowLastColumn="0"/>
+            </w:pPr>
+            <w:r>
+              <w:rPr>
+                <w:rFonts w:ascii="Times New Roman" w:hAnsi="Times New Roman" w:eastAsia="Times New Roman"/>
+                <w:sz w:val="14"/>
+              </w:rPr>
+              <w:t>{{ plan_2_owner }}</w:t>
+            </w:r>
+          </w:p>
+        </w:tc>
+        <w:tc>
+          <w:tcPr>
+            <w:tcW w:w="0" w:type="auto"/>
+            <w:vAlign w:val="center"/>
+            <w:hideMark/>
+          </w:tcPr>
+          <w:p>
+            <w:pPr>
+              <w:spacing w:after="0" w:line="312" w:lineRule="auto"/>
+              <w:jc w:val="center"/>
+              <w:cnfStyle w:val="000000000000" w:firstRow="0" w:lastRow="0" w:firstColumn="0" w:lastColumn="0" w:oddVBand="0" w:evenVBand="0" w:oddHBand="0" w:evenHBand="0" w:firstRowFirstColumn="0" w:firstRowLastColumn="0" w:lastRowFirstColumn="0" w:lastRowLastColumn="0"/>
+            </w:pPr>
+            <w:r>
+              <w:rPr>
+                <w:rFonts w:ascii="Times New Roman" w:hAnsi="Times New Roman" w:eastAsia="Times New Roman"/>
+                <w:sz w:val="14"/>
+              </w:rPr>
+              <w:t>{{ plan_2_deadline }}</w:t>
+            </w:r>
+          </w:p>
+        </w:tc>
+        <w:tc>
+          <w:tcPr>
+            <w:tcW w:w="0" w:type="auto"/>
+            <w:vAlign w:val="center"/>
+            <w:hideMark/>
+          </w:tcPr>
+          <w:p>
+            <w:pPr>
+              <w:spacing w:after="0" w:line="312" w:lineRule="auto"/>
+              <w:jc w:val="center"/>
+              <w:cnfStyle w:val="000000000000" w:firstRow="0" w:lastRow="0" w:firstColumn="0" w:lastColumn="0" w:oddVBand="0" w:evenVBand="0" w:oddHBand="0" w:evenHBand="0" w:firstRowFirstColumn="0" w:firstRowLastColumn="0" w:lastRowFirstColumn="0" w:lastRowLastColumn="0"/>
+            </w:pPr>
+            <w:r>
+              <w:rPr>
+                <w:rFonts w:ascii="Times New Roman" w:hAnsi="Times New Roman" w:eastAsia="Times New Roman"/>
+                <w:sz w:val="14"/>
+              </w:rPr>
+              <w:t>{{ plan_2_evidence }}</w:t>
             </w:r>
           </w:p>
         </w:tc>
@@ -3536,7 +3146,11 @@
         <w:jc w:val="right"/>
       </w:pPr>
       <w:r>
-        <w:t>TP. Hồ Chí Minh, ngày …… tháng ….. năm 20….</w:t>
+        <w:rPr>
+          <w:rFonts w:ascii="Times New Roman" w:hAnsi="Times New Roman" w:eastAsia="Times New Roman"/>
+          <w:sz w:val="20"/>
+        </w:rPr>
+        <w:t>TP. Hồ Chí Minh, ngày {{ generated_day }} tháng {{ generated_month }} năm {{ generated_year }}</w:t>
       </w:r>
     </w:p>
     <w:tbl>
@@ -3723,7 +3337,11 @@
               </w:rPr>
             </w:pPr>
             <w:r>
-              <w:t>……………………………</w:t>
+              <w:rPr>
+                <w:rFonts w:ascii="Times New Roman" w:hAnsi="Times New Roman" w:eastAsia="Times New Roman"/>
+                <w:sz w:val="18"/>
+              </w:rPr>
+              <w:t>{{ ho_ten }}</w:t>
             </w:r>
           </w:p>
         </w:tc>
@@ -3743,7 +3361,11 @@
               </w:rPr>
             </w:pPr>
             <w:r>
-              <w:t>……………………………</w:t>
+              <w:rPr>
+                <w:rFonts w:ascii="Times New Roman" w:hAnsi="Times New Roman" w:eastAsia="Times New Roman"/>
+                <w:sz w:val="18"/>
+              </w:rPr>
+              <w:t>{{ evaluator_name }}</w:t>
             </w:r>
           </w:p>
         </w:tc>
@@ -3872,7 +3494,11 @@
               </w:rPr>
             </w:pPr>
             <w:r>
-              <w:t>Đồng ý:</w:t>
+              <w:rPr>
+                <w:rFonts w:ascii="Times New Roman" w:hAnsi="Times New Roman" w:eastAsia="Times New Roman"/>
+                <w:sz w:val="14"/>
+              </w:rPr>
+              <w:t>{{ member_agree }}</w:t>
             </w:r>
           </w:p>
         </w:tc>
@@ -4306,7 +3932,11 @@
               <w:jc w:val="center"/>
             </w:pPr>
             <w:r>
-              <w:t>……………………………</w:t>
+              <w:rPr>
+                <w:rFonts w:ascii="Times New Roman" w:hAnsi="Times New Roman" w:eastAsia="Times New Roman"/>
+                <w:sz w:val="18"/>
+              </w:rPr>
+              <w:t>{{ discipline_lead_name }}</w:t>
             </w:r>
           </w:p>
         </w:tc>
@@ -4322,7 +3952,11 @@
               <w:jc w:val="center"/>
             </w:pPr>
             <w:r>
-              <w:t>……………………………</w:t>
+              <w:rPr>
+                <w:rFonts w:ascii="Times New Roman" w:hAnsi="Times New Roman" w:eastAsia="Times New Roman"/>
+                <w:sz w:val="18"/>
+              </w:rPr>
+              <w:t>{{ chair_name }}</w:t>
             </w:r>
           </w:p>
         </w:tc>
@@ -4438,7 +4072,11 @@
               </w:rPr>
             </w:pPr>
             <w:r>
-              <w:t>Đồng ý:</w:t>
+              <w:rPr>
+                <w:rFonts w:ascii="Times New Roman" w:hAnsi="Times New Roman" w:eastAsia="Times New Roman"/>
+                <w:sz w:val="14"/>
+              </w:rPr>
+              <w:t>{{ discipline_agree }}</w:t>
             </w:r>
           </w:p>
         </w:tc>
@@ -4810,41 +4448,53 @@
               <w:cnfStyle w:val="000000000000" w:firstRow="0" w:lastRow="0" w:firstColumn="0" w:lastColumn="0" w:oddVBand="0" w:evenVBand="0" w:oddHBand="0" w:evenHBand="0" w:firstRowFirstColumn="0" w:firstRowLastColumn="0" w:lastRowFirstColumn="0" w:lastRowLastColumn="0"/>
             </w:pPr>
             <w:r>
-              <w:t>…</w:t>
-            </w:r>
-          </w:p>
-        </w:tc>
-        <w:tc>
-          <w:tcPr>
-            <w:tcW w:w="0" w:type="auto"/>
-            <w:vAlign w:val="center"/>
-            <w:hideMark/>
-          </w:tcPr>
-          <w:p>
-            <w:pPr>
-              <w:spacing w:after="0" w:line="312" w:lineRule="auto"/>
-              <w:jc w:val="center"/>
-              <w:cnfStyle w:val="000000000000" w:firstRow="0" w:lastRow="0" w:firstColumn="0" w:lastColumn="0" w:oddVBand="0" w:evenVBand="0" w:oddHBand="0" w:evenHBand="0" w:firstRowFirstColumn="0" w:firstRowLastColumn="0" w:lastRowFirstColumn="0" w:lastRowLastColumn="0"/>
-            </w:pPr>
-            <w:r>
-              <w:t>Điểm danh / QR / Google Form / Biên bản</w:t>
-            </w:r>
-          </w:p>
-        </w:tc>
-        <w:tc>
-          <w:tcPr>
-            <w:tcW w:w="0" w:type="auto"/>
-            <w:vAlign w:val="center"/>
-            <w:hideMark/>
-          </w:tcPr>
-          <w:p>
-            <w:pPr>
-              <w:spacing w:after="0" w:line="312" w:lineRule="auto"/>
-              <w:jc w:val="center"/>
-              <w:cnfStyle w:val="000000000000" w:firstRow="0" w:lastRow="0" w:firstColumn="0" w:lastColumn="0" w:oddVBand="0" w:evenVBand="0" w:oddHBand="0" w:evenHBand="0" w:firstRowFirstColumn="0" w:firstRowLastColumn="0" w:lastRowFirstColumn="0" w:lastRowLastColumn="0"/>
-            </w:pPr>
-            <w:r>
-              <w:t>…</w:t>
+              <w:rPr>
+                <w:rFonts w:ascii="Times New Roman" w:hAnsi="Times New Roman" w:eastAsia="Times New Roman"/>
+                <w:sz w:val="14"/>
+              </w:rPr>
+              <w:t>{{ s_i_1 }}</w:t>
+            </w:r>
+          </w:p>
+        </w:tc>
+        <w:tc>
+          <w:tcPr>
+            <w:tcW w:w="0" w:type="auto"/>
+            <w:vAlign w:val="center"/>
+            <w:hideMark/>
+          </w:tcPr>
+          <w:p>
+            <w:pPr>
+              <w:spacing w:after="0" w:line="312" w:lineRule="auto"/>
+              <w:jc w:val="center"/>
+              <w:cnfStyle w:val="000000000000" w:firstRow="0" w:lastRow="0" w:firstColumn="0" w:lastColumn="0" w:oddVBand="0" w:evenVBand="0" w:oddHBand="0" w:evenHBand="0" w:firstRowFirstColumn="0" w:firstRowLastColumn="0" w:lastRowFirstColumn="0" w:lastRowLastColumn="0"/>
+            </w:pPr>
+            <w:r>
+              <w:rPr>
+                <w:rFonts w:ascii="Times New Roman" w:hAnsi="Times New Roman" w:eastAsia="Times New Roman"/>
+                <w:sz w:val="14"/>
+              </w:rPr>
+              <w:t>{{ e_i_1 }}</w:t>
+            </w:r>
+          </w:p>
+        </w:tc>
+        <w:tc>
+          <w:tcPr>
+            <w:tcW w:w="0" w:type="auto"/>
+            <w:vAlign w:val="center"/>
+            <w:hideMark/>
+          </w:tcPr>
+          <w:p>
+            <w:pPr>
+              <w:spacing w:after="0" w:line="312" w:lineRule="auto"/>
+              <w:jc w:val="center"/>
+              <w:cnfStyle w:val="000000000000" w:firstRow="0" w:lastRow="0" w:firstColumn="0" w:lastColumn="0" w:oddVBand="0" w:evenVBand="0" w:oddHBand="0" w:evenHBand="0" w:firstRowFirstColumn="0" w:firstRowLastColumn="0" w:lastRowFirstColumn="0" w:lastRowLastColumn="0"/>
+            </w:pPr>
+            <w:r>
+              <w:rPr>
+                <w:rFonts w:ascii="Times New Roman" w:hAnsi="Times New Roman" w:eastAsia="Times New Roman"/>
+                <w:sz w:val="14"/>
+              </w:rPr>
+              <w:t>{{ n_i_1 }}</w:t>
             </w:r>
           </w:p>
         </w:tc>
@@ -4914,41 +4564,53 @@
               <w:cnfStyle w:val="000000000000" w:firstRow="0" w:lastRow="0" w:firstColumn="0" w:lastColumn="0" w:oddVBand="0" w:evenVBand="0" w:oddHBand="0" w:evenHBand="0" w:firstRowFirstColumn="0" w:firstRowLastColumn="0" w:lastRowFirstColumn="0" w:lastRowLastColumn="0"/>
             </w:pPr>
             <w:r>
-              <w:t>…</w:t>
-            </w:r>
-          </w:p>
-        </w:tc>
-        <w:tc>
-          <w:tcPr>
-            <w:tcW w:w="0" w:type="auto"/>
-            <w:vAlign w:val="center"/>
-            <w:hideMark/>
-          </w:tcPr>
-          <w:p>
-            <w:pPr>
-              <w:spacing w:after="0" w:line="312" w:lineRule="auto"/>
-              <w:jc w:val="center"/>
-              <w:cnfStyle w:val="000000000000" w:firstRow="0" w:lastRow="0" w:firstColumn="0" w:lastColumn="0" w:oddVBand="0" w:evenVBand="0" w:oddHBand="0" w:evenHBand="0" w:firstRowFirstColumn="0" w:firstRowLastColumn="0" w:lastRowFirstColumn="0" w:lastRowLastColumn="0"/>
-            </w:pPr>
-            <w:r>
-              <w:t>Tin nhắn xin phép / Form xin phép / Xác nhận Trưởng ban</w:t>
-            </w:r>
-          </w:p>
-        </w:tc>
-        <w:tc>
-          <w:tcPr>
-            <w:tcW w:w="0" w:type="auto"/>
-            <w:vAlign w:val="center"/>
-            <w:hideMark/>
-          </w:tcPr>
-          <w:p>
-            <w:pPr>
-              <w:spacing w:after="0" w:line="312" w:lineRule="auto"/>
-              <w:jc w:val="center"/>
-              <w:cnfStyle w:val="000000000000" w:firstRow="0" w:lastRow="0" w:firstColumn="0" w:lastColumn="0" w:oddVBand="0" w:evenVBand="0" w:oddHBand="0" w:evenHBand="0" w:firstRowFirstColumn="0" w:firstRowLastColumn="0" w:lastRowFirstColumn="0" w:lastRowLastColumn="0"/>
-            </w:pPr>
-            <w:r>
-              <w:t>…</w:t>
+              <w:rPr>
+                <w:rFonts w:ascii="Times New Roman" w:hAnsi="Times New Roman" w:eastAsia="Times New Roman"/>
+                <w:sz w:val="14"/>
+              </w:rPr>
+              <w:t>{{ s_i_2 }}</w:t>
+            </w:r>
+          </w:p>
+        </w:tc>
+        <w:tc>
+          <w:tcPr>
+            <w:tcW w:w="0" w:type="auto"/>
+            <w:vAlign w:val="center"/>
+            <w:hideMark/>
+          </w:tcPr>
+          <w:p>
+            <w:pPr>
+              <w:spacing w:after="0" w:line="312" w:lineRule="auto"/>
+              <w:jc w:val="center"/>
+              <w:cnfStyle w:val="000000000000" w:firstRow="0" w:lastRow="0" w:firstColumn="0" w:lastColumn="0" w:oddVBand="0" w:evenVBand="0" w:oddHBand="0" w:evenHBand="0" w:firstRowFirstColumn="0" w:firstRowLastColumn="0" w:lastRowFirstColumn="0" w:lastRowLastColumn="0"/>
+            </w:pPr>
+            <w:r>
+              <w:rPr>
+                <w:rFonts w:ascii="Times New Roman" w:hAnsi="Times New Roman" w:eastAsia="Times New Roman"/>
+                <w:sz w:val="14"/>
+              </w:rPr>
+              <w:t>{{ e_i_2 }}</w:t>
+            </w:r>
+          </w:p>
+        </w:tc>
+        <w:tc>
+          <w:tcPr>
+            <w:tcW w:w="0" w:type="auto"/>
+            <w:vAlign w:val="center"/>
+            <w:hideMark/>
+          </w:tcPr>
+          <w:p>
+            <w:pPr>
+              <w:spacing w:after="0" w:line="312" w:lineRule="auto"/>
+              <w:jc w:val="center"/>
+              <w:cnfStyle w:val="000000000000" w:firstRow="0" w:lastRow="0" w:firstColumn="0" w:lastColumn="0" w:oddVBand="0" w:evenVBand="0" w:oddHBand="0" w:evenHBand="0" w:firstRowFirstColumn="0" w:firstRowLastColumn="0" w:lastRowFirstColumn="0" w:lastRowLastColumn="0"/>
+            </w:pPr>
+            <w:r>
+              <w:rPr>
+                <w:rFonts w:ascii="Times New Roman" w:hAnsi="Times New Roman" w:eastAsia="Times New Roman"/>
+                <w:sz w:val="14"/>
+              </w:rPr>
+              <w:t>{{ n_i_2 }}</w:t>
             </w:r>
           </w:p>
         </w:tc>
@@ -5018,41 +4680,53 @@
               <w:cnfStyle w:val="000000000000" w:firstRow="0" w:lastRow="0" w:firstColumn="0" w:lastColumn="0" w:oddVBand="0" w:evenVBand="0" w:oddHBand="0" w:evenHBand="0" w:firstRowFirstColumn="0" w:firstRowLastColumn="0" w:lastRowFirstColumn="0" w:lastRowLastColumn="0"/>
             </w:pPr>
             <w:r>
-              <w:t>…</w:t>
-            </w:r>
-          </w:p>
-        </w:tc>
-        <w:tc>
-          <w:tcPr>
-            <w:tcW w:w="0" w:type="auto"/>
-            <w:vAlign w:val="center"/>
-            <w:hideMark/>
-          </w:tcPr>
-          <w:p>
-            <w:pPr>
-              <w:spacing w:after="0" w:line="312" w:lineRule="auto"/>
-              <w:jc w:val="center"/>
-              <w:cnfStyle w:val="000000000000" w:firstRow="0" w:lastRow="0" w:firstColumn="0" w:lastColumn="0" w:oddVBand="0" w:evenVBand="0" w:oddHBand="0" w:evenHBand="0" w:firstRowFirstColumn="0" w:firstRowLastColumn="0" w:lastRowFirstColumn="0" w:lastRowLastColumn="0"/>
-            </w:pPr>
-            <w:r>
-              <w:t>Log tin nhắn / Timestamp / Biên bản họp</w:t>
-            </w:r>
-          </w:p>
-        </w:tc>
-        <w:tc>
-          <w:tcPr>
-            <w:tcW w:w="0" w:type="auto"/>
-            <w:vAlign w:val="center"/>
-            <w:hideMark/>
-          </w:tcPr>
-          <w:p>
-            <w:pPr>
-              <w:spacing w:after="0" w:line="312" w:lineRule="auto"/>
-              <w:jc w:val="center"/>
-              <w:cnfStyle w:val="000000000000" w:firstRow="0" w:lastRow="0" w:firstColumn="0" w:lastColumn="0" w:oddVBand="0" w:evenVBand="0" w:oddHBand="0" w:evenHBand="0" w:firstRowFirstColumn="0" w:firstRowLastColumn="0" w:lastRowFirstColumn="0" w:lastRowLastColumn="0"/>
-            </w:pPr>
-            <w:r>
-              <w:t>…</w:t>
+              <w:rPr>
+                <w:rFonts w:ascii="Times New Roman" w:hAnsi="Times New Roman" w:eastAsia="Times New Roman"/>
+                <w:sz w:val="14"/>
+              </w:rPr>
+              <w:t>{{ s_i_3 }}</w:t>
+            </w:r>
+          </w:p>
+        </w:tc>
+        <w:tc>
+          <w:tcPr>
+            <w:tcW w:w="0" w:type="auto"/>
+            <w:vAlign w:val="center"/>
+            <w:hideMark/>
+          </w:tcPr>
+          <w:p>
+            <w:pPr>
+              <w:spacing w:after="0" w:line="312" w:lineRule="auto"/>
+              <w:jc w:val="center"/>
+              <w:cnfStyle w:val="000000000000" w:firstRow="0" w:lastRow="0" w:firstColumn="0" w:lastColumn="0" w:oddVBand="0" w:evenVBand="0" w:oddHBand="0" w:evenHBand="0" w:firstRowFirstColumn="0" w:firstRowLastColumn="0" w:lastRowFirstColumn="0" w:lastRowLastColumn="0"/>
+            </w:pPr>
+            <w:r>
+              <w:rPr>
+                <w:rFonts w:ascii="Times New Roman" w:hAnsi="Times New Roman" w:eastAsia="Times New Roman"/>
+                <w:sz w:val="14"/>
+              </w:rPr>
+              <w:t>{{ e_i_3 }}</w:t>
+            </w:r>
+          </w:p>
+        </w:tc>
+        <w:tc>
+          <w:tcPr>
+            <w:tcW w:w="0" w:type="auto"/>
+            <w:vAlign w:val="center"/>
+            <w:hideMark/>
+          </w:tcPr>
+          <w:p>
+            <w:pPr>
+              <w:spacing w:after="0" w:line="312" w:lineRule="auto"/>
+              <w:jc w:val="center"/>
+              <w:cnfStyle w:val="000000000000" w:firstRow="0" w:lastRow="0" w:firstColumn="0" w:lastColumn="0" w:oddVBand="0" w:evenVBand="0" w:oddHBand="0" w:evenHBand="0" w:firstRowFirstColumn="0" w:firstRowLastColumn="0" w:lastRowFirstColumn="0" w:lastRowLastColumn="0"/>
+            </w:pPr>
+            <w:r>
+              <w:rPr>
+                <w:rFonts w:ascii="Times New Roman" w:hAnsi="Times New Roman" w:eastAsia="Times New Roman"/>
+                <w:sz w:val="14"/>
+              </w:rPr>
+              <w:t>{{ n_i_3 }}</w:t>
             </w:r>
           </w:p>
         </w:tc>
@@ -5122,41 +4796,53 @@
               <w:cnfStyle w:val="000000000000" w:firstRow="0" w:lastRow="0" w:firstColumn="0" w:lastColumn="0" w:oddVBand="0" w:evenVBand="0" w:oddHBand="0" w:evenHBand="0" w:firstRowFirstColumn="0" w:firstRowLastColumn="0" w:lastRowFirstColumn="0" w:lastRowLastColumn="0"/>
             </w:pPr>
             <w:r>
-              <w:t>…</w:t>
-            </w:r>
-          </w:p>
-        </w:tc>
-        <w:tc>
-          <w:tcPr>
-            <w:tcW w:w="0" w:type="auto"/>
-            <w:vAlign w:val="center"/>
-            <w:hideMark/>
-          </w:tcPr>
-          <w:p>
-            <w:pPr>
-              <w:spacing w:after="0" w:line="312" w:lineRule="auto"/>
-              <w:jc w:val="center"/>
-              <w:cnfStyle w:val="000000000000" w:firstRow="0" w:lastRow="0" w:firstColumn="0" w:lastColumn="0" w:oddVBand="0" w:evenVBand="0" w:oddHBand="0" w:evenHBand="0" w:firstRowFirstColumn="0" w:firstRowLastColumn="0" w:lastRowFirstColumn="0" w:lastRowLastColumn="0"/>
-            </w:pPr>
-            <w:r>
-              <w:t>Hồ sơ / Biểu mẫu / Xác nhận Ban Vận hành</w:t>
-            </w:r>
-          </w:p>
-        </w:tc>
-        <w:tc>
-          <w:tcPr>
-            <w:tcW w:w="0" w:type="auto"/>
-            <w:vAlign w:val="center"/>
-            <w:hideMark/>
-          </w:tcPr>
-          <w:p>
-            <w:pPr>
-              <w:spacing w:after="0" w:line="312" w:lineRule="auto"/>
-              <w:jc w:val="center"/>
-              <w:cnfStyle w:val="000000000000" w:firstRow="0" w:lastRow="0" w:firstColumn="0" w:lastColumn="0" w:oddVBand="0" w:evenVBand="0" w:oddHBand="0" w:evenHBand="0" w:firstRowFirstColumn="0" w:firstRowLastColumn="0" w:lastRowFirstColumn="0" w:lastRowLastColumn="0"/>
-            </w:pPr>
-            <w:r>
-              <w:t>…</w:t>
+              <w:rPr>
+                <w:rFonts w:ascii="Times New Roman" w:hAnsi="Times New Roman" w:eastAsia="Times New Roman"/>
+                <w:sz w:val="14"/>
+              </w:rPr>
+              <w:t>{{ s_i_4 }}</w:t>
+            </w:r>
+          </w:p>
+        </w:tc>
+        <w:tc>
+          <w:tcPr>
+            <w:tcW w:w="0" w:type="auto"/>
+            <w:vAlign w:val="center"/>
+            <w:hideMark/>
+          </w:tcPr>
+          <w:p>
+            <w:pPr>
+              <w:spacing w:after="0" w:line="312" w:lineRule="auto"/>
+              <w:jc w:val="center"/>
+              <w:cnfStyle w:val="000000000000" w:firstRow="0" w:lastRow="0" w:firstColumn="0" w:lastColumn="0" w:oddVBand="0" w:evenVBand="0" w:oddHBand="0" w:evenHBand="0" w:firstRowFirstColumn="0" w:firstRowLastColumn="0" w:lastRowFirstColumn="0" w:lastRowLastColumn="0"/>
+            </w:pPr>
+            <w:r>
+              <w:rPr>
+                <w:rFonts w:ascii="Times New Roman" w:hAnsi="Times New Roman" w:eastAsia="Times New Roman"/>
+                <w:sz w:val="14"/>
+              </w:rPr>
+              <w:t>{{ e_i_4 }}</w:t>
+            </w:r>
+          </w:p>
+        </w:tc>
+        <w:tc>
+          <w:tcPr>
+            <w:tcW w:w="0" w:type="auto"/>
+            <w:vAlign w:val="center"/>
+            <w:hideMark/>
+          </w:tcPr>
+          <w:p>
+            <w:pPr>
+              <w:spacing w:after="0" w:line="312" w:lineRule="auto"/>
+              <w:jc w:val="center"/>
+              <w:cnfStyle w:val="000000000000" w:firstRow="0" w:lastRow="0" w:firstColumn="0" w:lastColumn="0" w:oddVBand="0" w:evenVBand="0" w:oddHBand="0" w:evenHBand="0" w:firstRowFirstColumn="0" w:firstRowLastColumn="0" w:lastRowFirstColumn="0" w:lastRowLastColumn="0"/>
+            </w:pPr>
+            <w:r>
+              <w:rPr>
+                <w:rFonts w:ascii="Times New Roman" w:hAnsi="Times New Roman" w:eastAsia="Times New Roman"/>
+                <w:sz w:val="14"/>
+              </w:rPr>
+              <w:t>{{ n_i_4 }}</w:t>
             </w:r>
           </w:p>
         </w:tc>
@@ -5230,9 +4916,10 @@
             </w:pPr>
             <w:r>
               <w:rPr>
-                <w:b/>
-              </w:rPr>
-              <w:t>…</w:t>
+                <w:rFonts w:ascii="Times New Roman" w:hAnsi="Times New Roman" w:eastAsia="Times New Roman"/>
+                <w:sz w:val="14"/>
+              </w:rPr>
+              <w:t>{{ component_i_score }}</w:t>
             </w:r>
           </w:p>
         </w:tc>
@@ -5461,41 +5148,53 @@
               <w:cnfStyle w:val="000000000000" w:firstRow="0" w:lastRow="0" w:firstColumn="0" w:lastColumn="0" w:oddVBand="0" w:evenVBand="0" w:oddHBand="0" w:evenHBand="0" w:firstRowFirstColumn="0" w:firstRowLastColumn="0" w:lastRowFirstColumn="0" w:lastRowLastColumn="0"/>
             </w:pPr>
             <w:r>
-              <w:t>…</w:t>
-            </w:r>
-          </w:p>
-        </w:tc>
-        <w:tc>
-          <w:tcPr>
-            <w:tcW w:w="0" w:type="auto"/>
-            <w:vAlign w:val="center"/>
-            <w:hideMark/>
-          </w:tcPr>
-          <w:p>
-            <w:pPr>
-              <w:spacing w:after="0" w:line="312" w:lineRule="auto"/>
-              <w:jc w:val="center"/>
-              <w:cnfStyle w:val="000000000000" w:firstRow="0" w:lastRow="0" w:firstColumn="0" w:lastColumn="0" w:oddVBand="0" w:evenVBand="0" w:oddHBand="0" w:evenHBand="0" w:firstRowFirstColumn="0" w:firstRowLastColumn="0" w:lastRowFirstColumn="0" w:lastRowLastColumn="0"/>
-            </w:pPr>
-            <w:r>
-              <w:t>Nhận xét Trưởng ban / Kết quả nhiệm vụ</w:t>
-            </w:r>
-          </w:p>
-        </w:tc>
-        <w:tc>
-          <w:tcPr>
-            <w:tcW w:w="0" w:type="auto"/>
-            <w:vAlign w:val="center"/>
-            <w:hideMark/>
-          </w:tcPr>
-          <w:p>
-            <w:pPr>
-              <w:spacing w:after="0" w:line="312" w:lineRule="auto"/>
-              <w:jc w:val="center"/>
-              <w:cnfStyle w:val="000000000000" w:firstRow="0" w:lastRow="0" w:firstColumn="0" w:lastColumn="0" w:oddVBand="0" w:evenVBand="0" w:oddHBand="0" w:evenHBand="0" w:firstRowFirstColumn="0" w:firstRowLastColumn="0" w:lastRowFirstColumn="0" w:lastRowLastColumn="0"/>
-            </w:pPr>
-            <w:r>
-              <w:t>…</w:t>
+              <w:rPr>
+                <w:rFonts w:ascii="Times New Roman" w:hAnsi="Times New Roman" w:eastAsia="Times New Roman"/>
+                <w:sz w:val="14"/>
+              </w:rPr>
+              <w:t>{{ s_ii_1 }}</w:t>
+            </w:r>
+          </w:p>
+        </w:tc>
+        <w:tc>
+          <w:tcPr>
+            <w:tcW w:w="0" w:type="auto"/>
+            <w:vAlign w:val="center"/>
+            <w:hideMark/>
+          </w:tcPr>
+          <w:p>
+            <w:pPr>
+              <w:spacing w:after="0" w:line="312" w:lineRule="auto"/>
+              <w:jc w:val="center"/>
+              <w:cnfStyle w:val="000000000000" w:firstRow="0" w:lastRow="0" w:firstColumn="0" w:lastColumn="0" w:oddVBand="0" w:evenVBand="0" w:oddHBand="0" w:evenHBand="0" w:firstRowFirstColumn="0" w:firstRowLastColumn="0" w:lastRowFirstColumn="0" w:lastRowLastColumn="0"/>
+            </w:pPr>
+            <w:r>
+              <w:rPr>
+                <w:rFonts w:ascii="Times New Roman" w:hAnsi="Times New Roman" w:eastAsia="Times New Roman"/>
+                <w:sz w:val="14"/>
+              </w:rPr>
+              <w:t>{{ e_ii_1 }}</w:t>
+            </w:r>
+          </w:p>
+        </w:tc>
+        <w:tc>
+          <w:tcPr>
+            <w:tcW w:w="0" w:type="auto"/>
+            <w:vAlign w:val="center"/>
+            <w:hideMark/>
+          </w:tcPr>
+          <w:p>
+            <w:pPr>
+              <w:spacing w:after="0" w:line="312" w:lineRule="auto"/>
+              <w:jc w:val="center"/>
+              <w:cnfStyle w:val="000000000000" w:firstRow="0" w:lastRow="0" w:firstColumn="0" w:lastColumn="0" w:oddVBand="0" w:evenVBand="0" w:oddHBand="0" w:evenHBand="0" w:firstRowFirstColumn="0" w:firstRowLastColumn="0" w:lastRowFirstColumn="0" w:lastRowLastColumn="0"/>
+            </w:pPr>
+            <w:r>
+              <w:rPr>
+                <w:rFonts w:ascii="Times New Roman" w:hAnsi="Times New Roman" w:eastAsia="Times New Roman"/>
+                <w:sz w:val="14"/>
+              </w:rPr>
+              <w:t>{{ n_ii_1 }}</w:t>
             </w:r>
           </w:p>
         </w:tc>
@@ -5565,41 +5264,53 @@
               <w:cnfStyle w:val="000000000000" w:firstRow="0" w:lastRow="0" w:firstColumn="0" w:lastColumn="0" w:oddVBand="0" w:evenVBand="0" w:oddHBand="0" w:evenHBand="0" w:firstRowFirstColumn="0" w:firstRowLastColumn="0" w:lastRowFirstColumn="0" w:lastRowLastColumn="0"/>
             </w:pPr>
             <w:r>
-              <w:t>…</w:t>
-            </w:r>
-          </w:p>
-        </w:tc>
-        <w:tc>
-          <w:tcPr>
-            <w:tcW w:w="0" w:type="auto"/>
-            <w:vAlign w:val="center"/>
-            <w:hideMark/>
-          </w:tcPr>
-          <w:p>
-            <w:pPr>
-              <w:spacing w:after="0" w:line="312" w:lineRule="auto"/>
-              <w:jc w:val="center"/>
-              <w:cnfStyle w:val="000000000000" w:firstRow="0" w:lastRow="0" w:firstColumn="0" w:lastColumn="0" w:oddVBand="0" w:evenVBand="0" w:oddHBand="0" w:evenHBand="0" w:firstRowFirstColumn="0" w:firstRowLastColumn="0" w:lastRowFirstColumn="0" w:lastRowLastColumn="0"/>
-            </w:pPr>
-            <w:r>
-              <w:t>Task / Tin nhắn / Biên bản phân công</w:t>
-            </w:r>
-          </w:p>
-        </w:tc>
-        <w:tc>
-          <w:tcPr>
-            <w:tcW w:w="0" w:type="auto"/>
-            <w:vAlign w:val="center"/>
-            <w:hideMark/>
-          </w:tcPr>
-          <w:p>
-            <w:pPr>
-              <w:spacing w:after="0" w:line="312" w:lineRule="auto"/>
-              <w:jc w:val="center"/>
-              <w:cnfStyle w:val="000000000000" w:firstRow="0" w:lastRow="0" w:firstColumn="0" w:lastColumn="0" w:oddVBand="0" w:evenVBand="0" w:oddHBand="0" w:evenHBand="0" w:firstRowFirstColumn="0" w:firstRowLastColumn="0" w:lastRowFirstColumn="0" w:lastRowLastColumn="0"/>
-            </w:pPr>
-            <w:r>
-              <w:t>…</w:t>
+              <w:rPr>
+                <w:rFonts w:ascii="Times New Roman" w:hAnsi="Times New Roman" w:eastAsia="Times New Roman"/>
+                <w:sz w:val="14"/>
+              </w:rPr>
+              <w:t>{{ s_ii_2 }}</w:t>
+            </w:r>
+          </w:p>
+        </w:tc>
+        <w:tc>
+          <w:tcPr>
+            <w:tcW w:w="0" w:type="auto"/>
+            <w:vAlign w:val="center"/>
+            <w:hideMark/>
+          </w:tcPr>
+          <w:p>
+            <w:pPr>
+              <w:spacing w:after="0" w:line="312" w:lineRule="auto"/>
+              <w:jc w:val="center"/>
+              <w:cnfStyle w:val="000000000000" w:firstRow="0" w:lastRow="0" w:firstColumn="0" w:lastColumn="0" w:oddVBand="0" w:evenVBand="0" w:oddHBand="0" w:evenHBand="0" w:firstRowFirstColumn="0" w:firstRowLastColumn="0" w:lastRowFirstColumn="0" w:lastRowLastColumn="0"/>
+            </w:pPr>
+            <w:r>
+              <w:rPr>
+                <w:rFonts w:ascii="Times New Roman" w:hAnsi="Times New Roman" w:eastAsia="Times New Roman"/>
+                <w:sz w:val="14"/>
+              </w:rPr>
+              <w:t>{{ e_ii_2 }}</w:t>
+            </w:r>
+          </w:p>
+        </w:tc>
+        <w:tc>
+          <w:tcPr>
+            <w:tcW w:w="0" w:type="auto"/>
+            <w:vAlign w:val="center"/>
+            <w:hideMark/>
+          </w:tcPr>
+          <w:p>
+            <w:pPr>
+              <w:spacing w:after="0" w:line="312" w:lineRule="auto"/>
+              <w:jc w:val="center"/>
+              <w:cnfStyle w:val="000000000000" w:firstRow="0" w:lastRow="0" w:firstColumn="0" w:lastColumn="0" w:oddVBand="0" w:evenVBand="0" w:oddHBand="0" w:evenHBand="0" w:firstRowFirstColumn="0" w:firstRowLastColumn="0" w:lastRowFirstColumn="0" w:lastRowLastColumn="0"/>
+            </w:pPr>
+            <w:r>
+              <w:rPr>
+                <w:rFonts w:ascii="Times New Roman" w:hAnsi="Times New Roman" w:eastAsia="Times New Roman"/>
+                <w:sz w:val="14"/>
+              </w:rPr>
+              <w:t>{{ n_ii_2 }}</w:t>
             </w:r>
           </w:p>
         </w:tc>
@@ -5670,41 +5381,53 @@
               <w:cnfStyle w:val="000000000000" w:firstRow="0" w:lastRow="0" w:firstColumn="0" w:lastColumn="0" w:oddVBand="0" w:evenVBand="0" w:oddHBand="0" w:evenHBand="0" w:firstRowFirstColumn="0" w:firstRowLastColumn="0" w:lastRowFirstColumn="0" w:lastRowLastColumn="0"/>
             </w:pPr>
             <w:r>
-              <w:t>…</w:t>
-            </w:r>
-          </w:p>
-        </w:tc>
-        <w:tc>
-          <w:tcPr>
-            <w:tcW w:w="0" w:type="auto"/>
-            <w:vAlign w:val="center"/>
-            <w:hideMark/>
-          </w:tcPr>
-          <w:p>
-            <w:pPr>
-              <w:spacing w:after="0" w:line="312" w:lineRule="auto"/>
-              <w:jc w:val="center"/>
-              <w:cnfStyle w:val="000000000000" w:firstRow="0" w:lastRow="0" w:firstColumn="0" w:lastColumn="0" w:oddVBand="0" w:evenVBand="0" w:oddHBand="0" w:evenHBand="0" w:firstRowFirstColumn="0" w:firstRowLastColumn="0" w:lastRowFirstColumn="0" w:lastRowLastColumn="0"/>
-            </w:pPr>
-            <w:r>
-              <w:t>Nội dung truyền thông / Biên bản / Xác nhận BCN</w:t>
-            </w:r>
-          </w:p>
-        </w:tc>
-        <w:tc>
-          <w:tcPr>
-            <w:tcW w:w="0" w:type="auto"/>
-            <w:vAlign w:val="center"/>
-            <w:hideMark/>
-          </w:tcPr>
-          <w:p>
-            <w:pPr>
-              <w:spacing w:after="0" w:line="312" w:lineRule="auto"/>
-              <w:jc w:val="center"/>
-              <w:cnfStyle w:val="000000000000" w:firstRow="0" w:lastRow="0" w:firstColumn="0" w:lastColumn="0" w:oddVBand="0" w:evenVBand="0" w:oddHBand="0" w:evenHBand="0" w:firstRowFirstColumn="0" w:firstRowLastColumn="0" w:lastRowFirstColumn="0" w:lastRowLastColumn="0"/>
-            </w:pPr>
-            <w:r>
-              <w:t>…</w:t>
+              <w:rPr>
+                <w:rFonts w:ascii="Times New Roman" w:hAnsi="Times New Roman" w:eastAsia="Times New Roman"/>
+                <w:sz w:val="14"/>
+              </w:rPr>
+              <w:t>{{ s_ii_3 }}</w:t>
+            </w:r>
+          </w:p>
+        </w:tc>
+        <w:tc>
+          <w:tcPr>
+            <w:tcW w:w="0" w:type="auto"/>
+            <w:vAlign w:val="center"/>
+            <w:hideMark/>
+          </w:tcPr>
+          <w:p>
+            <w:pPr>
+              <w:spacing w:after="0" w:line="312" w:lineRule="auto"/>
+              <w:jc w:val="center"/>
+              <w:cnfStyle w:val="000000000000" w:firstRow="0" w:lastRow="0" w:firstColumn="0" w:lastColumn="0" w:oddVBand="0" w:evenVBand="0" w:oddHBand="0" w:evenHBand="0" w:firstRowFirstColumn="0" w:firstRowLastColumn="0" w:lastRowFirstColumn="0" w:lastRowLastColumn="0"/>
+            </w:pPr>
+            <w:r>
+              <w:rPr>
+                <w:rFonts w:ascii="Times New Roman" w:hAnsi="Times New Roman" w:eastAsia="Times New Roman"/>
+                <w:sz w:val="14"/>
+              </w:rPr>
+              <w:t>{{ e_ii_3 }}</w:t>
+            </w:r>
+          </w:p>
+        </w:tc>
+        <w:tc>
+          <w:tcPr>
+            <w:tcW w:w="0" w:type="auto"/>
+            <w:vAlign w:val="center"/>
+            <w:hideMark/>
+          </w:tcPr>
+          <w:p>
+            <w:pPr>
+              <w:spacing w:after="0" w:line="312" w:lineRule="auto"/>
+              <w:jc w:val="center"/>
+              <w:cnfStyle w:val="000000000000" w:firstRow="0" w:lastRow="0" w:firstColumn="0" w:lastColumn="0" w:oddVBand="0" w:evenVBand="0" w:oddHBand="0" w:evenHBand="0" w:firstRowFirstColumn="0" w:firstRowLastColumn="0" w:lastRowFirstColumn="0" w:lastRowLastColumn="0"/>
+            </w:pPr>
+            <w:r>
+              <w:rPr>
+                <w:rFonts w:ascii="Times New Roman" w:hAnsi="Times New Roman" w:eastAsia="Times New Roman"/>
+                <w:sz w:val="14"/>
+              </w:rPr>
+              <w:t>{{ n_ii_3 }}</w:t>
             </w:r>
           </w:p>
         </w:tc>
@@ -5774,41 +5497,53 @@
               <w:cnfStyle w:val="000000000000" w:firstRow="0" w:lastRow="0" w:firstColumn="0" w:lastColumn="0" w:oddVBand="0" w:evenVBand="0" w:oddHBand="0" w:evenHBand="0" w:firstRowFirstColumn="0" w:firstRowLastColumn="0" w:lastRowFirstColumn="0" w:lastRowLastColumn="0"/>
             </w:pPr>
             <w:r>
-              <w:t>…</w:t>
-            </w:r>
-          </w:p>
-        </w:tc>
-        <w:tc>
-          <w:tcPr>
-            <w:tcW w:w="0" w:type="auto"/>
-            <w:vAlign w:val="center"/>
-            <w:hideMark/>
-          </w:tcPr>
-          <w:p>
-            <w:pPr>
-              <w:spacing w:after="0" w:line="312" w:lineRule="auto"/>
-              <w:jc w:val="center"/>
-              <w:cnfStyle w:val="000000000000" w:firstRow="0" w:lastRow="0" w:firstColumn="0" w:lastColumn="0" w:oddVBand="0" w:evenVBand="0" w:oddHBand="0" w:evenHBand="0" w:firstRowFirstColumn="0" w:firstRowLastColumn="0" w:lastRowFirstColumn="0" w:lastRowLastColumn="0"/>
-            </w:pPr>
-            <w:r>
-              <w:t>Log truy cập / Xác nhận quản trị / Biên bản</w:t>
-            </w:r>
-          </w:p>
-        </w:tc>
-        <w:tc>
-          <w:tcPr>
-            <w:tcW w:w="0" w:type="auto"/>
-            <w:vAlign w:val="center"/>
-            <w:hideMark/>
-          </w:tcPr>
-          <w:p>
-            <w:pPr>
-              <w:spacing w:after="0" w:line="312" w:lineRule="auto"/>
-              <w:jc w:val="center"/>
-              <w:cnfStyle w:val="000000000000" w:firstRow="0" w:lastRow="0" w:firstColumn="0" w:lastColumn="0" w:oddVBand="0" w:evenVBand="0" w:oddHBand="0" w:evenHBand="0" w:firstRowFirstColumn="0" w:firstRowLastColumn="0" w:lastRowFirstColumn="0" w:lastRowLastColumn="0"/>
-            </w:pPr>
-            <w:r>
-              <w:t>…</w:t>
+              <w:rPr>
+                <w:rFonts w:ascii="Times New Roman" w:hAnsi="Times New Roman" w:eastAsia="Times New Roman"/>
+                <w:sz w:val="14"/>
+              </w:rPr>
+              <w:t>{{ s_ii_4 }}</w:t>
+            </w:r>
+          </w:p>
+        </w:tc>
+        <w:tc>
+          <w:tcPr>
+            <w:tcW w:w="0" w:type="auto"/>
+            <w:vAlign w:val="center"/>
+            <w:hideMark/>
+          </w:tcPr>
+          <w:p>
+            <w:pPr>
+              <w:spacing w:after="0" w:line="312" w:lineRule="auto"/>
+              <w:jc w:val="center"/>
+              <w:cnfStyle w:val="000000000000" w:firstRow="0" w:lastRow="0" w:firstColumn="0" w:lastColumn="0" w:oddVBand="0" w:evenVBand="0" w:oddHBand="0" w:evenHBand="0" w:firstRowFirstColumn="0" w:firstRowLastColumn="0" w:lastRowFirstColumn="0" w:lastRowLastColumn="0"/>
+            </w:pPr>
+            <w:r>
+              <w:rPr>
+                <w:rFonts w:ascii="Times New Roman" w:hAnsi="Times New Roman" w:eastAsia="Times New Roman"/>
+                <w:sz w:val="14"/>
+              </w:rPr>
+              <w:t>{{ e_ii_4 }}</w:t>
+            </w:r>
+          </w:p>
+        </w:tc>
+        <w:tc>
+          <w:tcPr>
+            <w:tcW w:w="0" w:type="auto"/>
+            <w:vAlign w:val="center"/>
+            <w:hideMark/>
+          </w:tcPr>
+          <w:p>
+            <w:pPr>
+              <w:spacing w:after="0" w:line="312" w:lineRule="auto"/>
+              <w:jc w:val="center"/>
+              <w:cnfStyle w:val="000000000000" w:firstRow="0" w:lastRow="0" w:firstColumn="0" w:lastColumn="0" w:oddVBand="0" w:evenVBand="0" w:oddHBand="0" w:evenHBand="0" w:firstRowFirstColumn="0" w:firstRowLastColumn="0" w:lastRowFirstColumn="0" w:lastRowLastColumn="0"/>
+            </w:pPr>
+            <w:r>
+              <w:rPr>
+                <w:rFonts w:ascii="Times New Roman" w:hAnsi="Times New Roman" w:eastAsia="Times New Roman"/>
+                <w:sz w:val="14"/>
+              </w:rPr>
+              <w:t>{{ n_ii_4 }}</w:t>
             </w:r>
           </w:p>
         </w:tc>
@@ -5882,9 +5617,10 @@
             </w:pPr>
             <w:r>
               <w:rPr>
-                <w:b/>
-              </w:rPr>
-              <w:t>…</w:t>
+                <w:rFonts w:ascii="Times New Roman" w:hAnsi="Times New Roman" w:eastAsia="Times New Roman"/>
+                <w:sz w:val="14"/>
+              </w:rPr>
+              <w:t>{{ component_ii_score }}</w:t>
             </w:r>
           </w:p>
         </w:tc>
@@ -6112,41 +5848,53 @@
               <w:cnfStyle w:val="000000000000" w:firstRow="0" w:lastRow="0" w:firstColumn="0" w:lastColumn="0" w:oddVBand="0" w:evenVBand="0" w:oddHBand="0" w:evenHBand="0" w:firstRowFirstColumn="0" w:firstRowLastColumn="0" w:lastRowFirstColumn="0" w:lastRowLastColumn="0"/>
             </w:pPr>
             <w:r>
-              <w:t>…</w:t>
-            </w:r>
-          </w:p>
-        </w:tc>
-        <w:tc>
-          <w:tcPr>
-            <w:tcW w:w="0" w:type="auto"/>
-            <w:vAlign w:val="center"/>
-            <w:hideMark/>
-          </w:tcPr>
-          <w:p>
-            <w:pPr>
-              <w:spacing w:after="0" w:line="312" w:lineRule="auto"/>
-              <w:jc w:val="center"/>
-              <w:cnfStyle w:val="000000000000" w:firstRow="0" w:lastRow="0" w:firstColumn="0" w:lastColumn="0" w:oddVBand="0" w:evenVBand="0" w:oddHBand="0" w:evenHBand="0" w:firstRowFirstColumn="0" w:firstRowLastColumn="0" w:lastRowFirstColumn="0" w:lastRowLastColumn="0"/>
-            </w:pPr>
-            <w:r>
-              <w:t>Task / Checklist / Biên bản nghiệm thu</w:t>
-            </w:r>
-          </w:p>
-        </w:tc>
-        <w:tc>
-          <w:tcPr>
-            <w:tcW w:w="0" w:type="auto"/>
-            <w:vAlign w:val="center"/>
-            <w:hideMark/>
-          </w:tcPr>
-          <w:p>
-            <w:pPr>
-              <w:spacing w:after="0" w:line="312" w:lineRule="auto"/>
-              <w:jc w:val="center"/>
-              <w:cnfStyle w:val="000000000000" w:firstRow="0" w:lastRow="0" w:firstColumn="0" w:lastColumn="0" w:oddVBand="0" w:evenVBand="0" w:oddHBand="0" w:evenHBand="0" w:firstRowFirstColumn="0" w:firstRowLastColumn="0" w:lastRowFirstColumn="0" w:lastRowLastColumn="0"/>
-            </w:pPr>
-            <w:r>
-              <w:t>…</w:t>
+              <w:rPr>
+                <w:rFonts w:ascii="Times New Roman" w:hAnsi="Times New Roman" w:eastAsia="Times New Roman"/>
+                <w:sz w:val="14"/>
+              </w:rPr>
+              <w:t>{{ s_iii_a_1 }}</w:t>
+            </w:r>
+          </w:p>
+        </w:tc>
+        <w:tc>
+          <w:tcPr>
+            <w:tcW w:w="0" w:type="auto"/>
+            <w:vAlign w:val="center"/>
+            <w:hideMark/>
+          </w:tcPr>
+          <w:p>
+            <w:pPr>
+              <w:spacing w:after="0" w:line="312" w:lineRule="auto"/>
+              <w:jc w:val="center"/>
+              <w:cnfStyle w:val="000000000000" w:firstRow="0" w:lastRow="0" w:firstColumn="0" w:lastColumn="0" w:oddVBand="0" w:evenVBand="0" w:oddHBand="0" w:evenHBand="0" w:firstRowFirstColumn="0" w:firstRowLastColumn="0" w:lastRowFirstColumn="0" w:lastRowLastColumn="0"/>
+            </w:pPr>
+            <w:r>
+              <w:rPr>
+                <w:rFonts w:ascii="Times New Roman" w:hAnsi="Times New Roman" w:eastAsia="Times New Roman"/>
+                <w:sz w:val="14"/>
+              </w:rPr>
+              <w:t>{{ e_iii_a_1 }}</w:t>
+            </w:r>
+          </w:p>
+        </w:tc>
+        <w:tc>
+          <w:tcPr>
+            <w:tcW w:w="0" w:type="auto"/>
+            <w:vAlign w:val="center"/>
+            <w:hideMark/>
+          </w:tcPr>
+          <w:p>
+            <w:pPr>
+              <w:spacing w:after="0" w:line="312" w:lineRule="auto"/>
+              <w:jc w:val="center"/>
+              <w:cnfStyle w:val="000000000000" w:firstRow="0" w:lastRow="0" w:firstColumn="0" w:lastColumn="0" w:oddVBand="0" w:evenVBand="0" w:oddHBand="0" w:evenHBand="0" w:firstRowFirstColumn="0" w:firstRowLastColumn="0" w:lastRowFirstColumn="0" w:lastRowLastColumn="0"/>
+            </w:pPr>
+            <w:r>
+              <w:rPr>
+                <w:rFonts w:ascii="Times New Roman" w:hAnsi="Times New Roman" w:eastAsia="Times New Roman"/>
+                <w:sz w:val="14"/>
+              </w:rPr>
+              <w:t>{{ n_iii_a_1 }}</w:t>
             </w:r>
           </w:p>
         </w:tc>
@@ -6216,41 +5964,53 @@
               <w:cnfStyle w:val="000000000000" w:firstRow="0" w:lastRow="0" w:firstColumn="0" w:lastColumn="0" w:oddVBand="0" w:evenVBand="0" w:oddHBand="0" w:evenHBand="0" w:firstRowFirstColumn="0" w:firstRowLastColumn="0" w:lastRowFirstColumn="0" w:lastRowLastColumn="0"/>
             </w:pPr>
             <w:r>
-              <w:t>…</w:t>
-            </w:r>
-          </w:p>
-        </w:tc>
-        <w:tc>
-          <w:tcPr>
-            <w:tcW w:w="0" w:type="auto"/>
-            <w:vAlign w:val="center"/>
-            <w:hideMark/>
-          </w:tcPr>
-          <w:p>
-            <w:pPr>
-              <w:spacing w:after="0" w:line="312" w:lineRule="auto"/>
-              <w:jc w:val="center"/>
-              <w:cnfStyle w:val="000000000000" w:firstRow="0" w:lastRow="0" w:firstColumn="0" w:lastColumn="0" w:oddVBand="0" w:evenVBand="0" w:oddHBand="0" w:evenHBand="0" w:firstRowFirstColumn="0" w:firstRowLastColumn="0" w:lastRowFirstColumn="0" w:lastRowLastColumn="0"/>
-            </w:pPr>
-            <w:r>
-              <w:t>File sản phẩm / Link thiết kế / Source code / Báo cáo</w:t>
-            </w:r>
-          </w:p>
-        </w:tc>
-        <w:tc>
-          <w:tcPr>
-            <w:tcW w:w="0" w:type="auto"/>
-            <w:vAlign w:val="center"/>
-            <w:hideMark/>
-          </w:tcPr>
-          <w:p>
-            <w:pPr>
-              <w:spacing w:after="0" w:line="312" w:lineRule="auto"/>
-              <w:jc w:val="center"/>
-              <w:cnfStyle w:val="000000000000" w:firstRow="0" w:lastRow="0" w:firstColumn="0" w:lastColumn="0" w:oddVBand="0" w:evenVBand="0" w:oddHBand="0" w:evenHBand="0" w:firstRowFirstColumn="0" w:firstRowLastColumn="0" w:lastRowFirstColumn="0" w:lastRowLastColumn="0"/>
-            </w:pPr>
-            <w:r>
-              <w:t>…</w:t>
+              <w:rPr>
+                <w:rFonts w:ascii="Times New Roman" w:hAnsi="Times New Roman" w:eastAsia="Times New Roman"/>
+                <w:sz w:val="14"/>
+              </w:rPr>
+              <w:t>{{ s_iii_a_2 }}</w:t>
+            </w:r>
+          </w:p>
+        </w:tc>
+        <w:tc>
+          <w:tcPr>
+            <w:tcW w:w="0" w:type="auto"/>
+            <w:vAlign w:val="center"/>
+            <w:hideMark/>
+          </w:tcPr>
+          <w:p>
+            <w:pPr>
+              <w:spacing w:after="0" w:line="312" w:lineRule="auto"/>
+              <w:jc w:val="center"/>
+              <w:cnfStyle w:val="000000000000" w:firstRow="0" w:lastRow="0" w:firstColumn="0" w:lastColumn="0" w:oddVBand="0" w:evenVBand="0" w:oddHBand="0" w:evenHBand="0" w:firstRowFirstColumn="0" w:firstRowLastColumn="0" w:lastRowFirstColumn="0" w:lastRowLastColumn="0"/>
+            </w:pPr>
+            <w:r>
+              <w:rPr>
+                <w:rFonts w:ascii="Times New Roman" w:hAnsi="Times New Roman" w:eastAsia="Times New Roman"/>
+                <w:sz w:val="14"/>
+              </w:rPr>
+              <w:t>{{ e_iii_a_2 }}</w:t>
+            </w:r>
+          </w:p>
+        </w:tc>
+        <w:tc>
+          <w:tcPr>
+            <w:tcW w:w="0" w:type="auto"/>
+            <w:vAlign w:val="center"/>
+            <w:hideMark/>
+          </w:tcPr>
+          <w:p>
+            <w:pPr>
+              <w:spacing w:after="0" w:line="312" w:lineRule="auto"/>
+              <w:jc w:val="center"/>
+              <w:cnfStyle w:val="000000000000" w:firstRow="0" w:lastRow="0" w:firstColumn="0" w:lastColumn="0" w:oddVBand="0" w:evenVBand="0" w:oddHBand="0" w:evenHBand="0" w:firstRowFirstColumn="0" w:firstRowLastColumn="0" w:lastRowFirstColumn="0" w:lastRowLastColumn="0"/>
+            </w:pPr>
+            <w:r>
+              <w:rPr>
+                <w:rFonts w:ascii="Times New Roman" w:hAnsi="Times New Roman" w:eastAsia="Times New Roman"/>
+                <w:sz w:val="14"/>
+              </w:rPr>
+              <w:t>{{ n_iii_a_2 }}</w:t>
             </w:r>
           </w:p>
         </w:tc>
@@ -6320,41 +6080,53 @@
               <w:cnfStyle w:val="000000000000" w:firstRow="0" w:lastRow="0" w:firstColumn="0" w:lastColumn="0" w:oddVBand="0" w:evenVBand="0" w:oddHBand="0" w:evenHBand="0" w:firstRowFirstColumn="0" w:firstRowLastColumn="0" w:lastRowFirstColumn="0" w:lastRowLastColumn="0"/>
             </w:pPr>
             <w:r>
-              <w:t>…</w:t>
-            </w:r>
-          </w:p>
-        </w:tc>
-        <w:tc>
-          <w:tcPr>
-            <w:tcW w:w="0" w:type="auto"/>
-            <w:vAlign w:val="center"/>
-            <w:hideMark/>
-          </w:tcPr>
-          <w:p>
-            <w:pPr>
-              <w:spacing w:after="0" w:line="312" w:lineRule="auto"/>
-              <w:jc w:val="center"/>
-              <w:cnfStyle w:val="000000000000" w:firstRow="0" w:lastRow="0" w:firstColumn="0" w:lastColumn="0" w:oddVBand="0" w:evenVBand="0" w:oddHBand="0" w:evenHBand="0" w:firstRowFirstColumn="0" w:firstRowLastColumn="0" w:lastRowFirstColumn="0" w:lastRowLastColumn="0"/>
-            </w:pPr>
-            <w:r>
-              <w:t>Log cập nhật / Timeline / Trello / Notion / Sheet</w:t>
-            </w:r>
-          </w:p>
-        </w:tc>
-        <w:tc>
-          <w:tcPr>
-            <w:tcW w:w="0" w:type="auto"/>
-            <w:vAlign w:val="center"/>
-            <w:hideMark/>
-          </w:tcPr>
-          <w:p>
-            <w:pPr>
-              <w:spacing w:after="0" w:line="312" w:lineRule="auto"/>
-              <w:jc w:val="center"/>
-              <w:cnfStyle w:val="000000000000" w:firstRow="0" w:lastRow="0" w:firstColumn="0" w:lastColumn="0" w:oddVBand="0" w:evenVBand="0" w:oddHBand="0" w:evenHBand="0" w:firstRowFirstColumn="0" w:firstRowLastColumn="0" w:lastRowFirstColumn="0" w:lastRowLastColumn="0"/>
-            </w:pPr>
-            <w:r>
-              <w:t>…</w:t>
+              <w:rPr>
+                <w:rFonts w:ascii="Times New Roman" w:hAnsi="Times New Roman" w:eastAsia="Times New Roman"/>
+                <w:sz w:val="14"/>
+              </w:rPr>
+              <w:t>{{ s_iii_a_3 }}</w:t>
+            </w:r>
+          </w:p>
+        </w:tc>
+        <w:tc>
+          <w:tcPr>
+            <w:tcW w:w="0" w:type="auto"/>
+            <w:vAlign w:val="center"/>
+            <w:hideMark/>
+          </w:tcPr>
+          <w:p>
+            <w:pPr>
+              <w:spacing w:after="0" w:line="312" w:lineRule="auto"/>
+              <w:jc w:val="center"/>
+              <w:cnfStyle w:val="000000000000" w:firstRow="0" w:lastRow="0" w:firstColumn="0" w:lastColumn="0" w:oddVBand="0" w:evenVBand="0" w:oddHBand="0" w:evenHBand="0" w:firstRowFirstColumn="0" w:firstRowLastColumn="0" w:lastRowFirstColumn="0" w:lastRowLastColumn="0"/>
+            </w:pPr>
+            <w:r>
+              <w:rPr>
+                <w:rFonts w:ascii="Times New Roman" w:hAnsi="Times New Roman" w:eastAsia="Times New Roman"/>
+                <w:sz w:val="14"/>
+              </w:rPr>
+              <w:t>{{ e_iii_a_3 }}</w:t>
+            </w:r>
+          </w:p>
+        </w:tc>
+        <w:tc>
+          <w:tcPr>
+            <w:tcW w:w="0" w:type="auto"/>
+            <w:vAlign w:val="center"/>
+            <w:hideMark/>
+          </w:tcPr>
+          <w:p>
+            <w:pPr>
+              <w:spacing w:after="0" w:line="312" w:lineRule="auto"/>
+              <w:jc w:val="center"/>
+              <w:cnfStyle w:val="000000000000" w:firstRow="0" w:lastRow="0" w:firstColumn="0" w:lastColumn="0" w:oddVBand="0" w:evenVBand="0" w:oddHBand="0" w:evenHBand="0" w:firstRowFirstColumn="0" w:firstRowLastColumn="0" w:lastRowFirstColumn="0" w:lastRowLastColumn="0"/>
+            </w:pPr>
+            <w:r>
+              <w:rPr>
+                <w:rFonts w:ascii="Times New Roman" w:hAnsi="Times New Roman" w:eastAsia="Times New Roman"/>
+                <w:sz w:val="14"/>
+              </w:rPr>
+              <w:t>{{ n_iii_a_3 }}</w:t>
             </w:r>
           </w:p>
         </w:tc>
@@ -6424,41 +6196,53 @@
               <w:cnfStyle w:val="000000000000" w:firstRow="0" w:lastRow="0" w:firstColumn="0" w:lastColumn="0" w:oddVBand="0" w:evenVBand="0" w:oddHBand="0" w:evenHBand="0" w:firstRowFirstColumn="0" w:firstRowLastColumn="0" w:lastRowFirstColumn="0" w:lastRowLastColumn="0"/>
             </w:pPr>
             <w:r>
-              <w:t>…</w:t>
-            </w:r>
-          </w:p>
-        </w:tc>
-        <w:tc>
-          <w:tcPr>
-            <w:tcW w:w="0" w:type="auto"/>
-            <w:vAlign w:val="center"/>
-            <w:hideMark/>
-          </w:tcPr>
-          <w:p>
-            <w:pPr>
-              <w:spacing w:after="0" w:line="312" w:lineRule="auto"/>
-              <w:jc w:val="center"/>
-              <w:cnfStyle w:val="000000000000" w:firstRow="0" w:lastRow="0" w:firstColumn="0" w:lastColumn="0" w:oddVBand="0" w:evenVBand="0" w:oddHBand="0" w:evenHBand="0" w:firstRowFirstColumn="0" w:firstRowLastColumn="0" w:lastRowFirstColumn="0" w:lastRowLastColumn="0"/>
-            </w:pPr>
-            <w:r>
-              <w:t>Phản hồi nhóm / Biên bản / Nhận xét Trưởng ban</w:t>
-            </w:r>
-          </w:p>
-        </w:tc>
-        <w:tc>
-          <w:tcPr>
-            <w:tcW w:w="0" w:type="auto"/>
-            <w:vAlign w:val="center"/>
-            <w:hideMark/>
-          </w:tcPr>
-          <w:p>
-            <w:pPr>
-              <w:spacing w:after="0" w:line="312" w:lineRule="auto"/>
-              <w:jc w:val="center"/>
-              <w:cnfStyle w:val="000000000000" w:firstRow="0" w:lastRow="0" w:firstColumn="0" w:lastColumn="0" w:oddVBand="0" w:evenVBand="0" w:oddHBand="0" w:evenHBand="0" w:firstRowFirstColumn="0" w:firstRowLastColumn="0" w:lastRowFirstColumn="0" w:lastRowLastColumn="0"/>
-            </w:pPr>
-            <w:r>
-              <w:t>…</w:t>
+              <w:rPr>
+                <w:rFonts w:ascii="Times New Roman" w:hAnsi="Times New Roman" w:eastAsia="Times New Roman"/>
+                <w:sz w:val="14"/>
+              </w:rPr>
+              <w:t>{{ s_iii_a_4 }}</w:t>
+            </w:r>
+          </w:p>
+        </w:tc>
+        <w:tc>
+          <w:tcPr>
+            <w:tcW w:w="0" w:type="auto"/>
+            <w:vAlign w:val="center"/>
+            <w:hideMark/>
+          </w:tcPr>
+          <w:p>
+            <w:pPr>
+              <w:spacing w:after="0" w:line="312" w:lineRule="auto"/>
+              <w:jc w:val="center"/>
+              <w:cnfStyle w:val="000000000000" w:firstRow="0" w:lastRow="0" w:firstColumn="0" w:lastColumn="0" w:oddVBand="0" w:evenVBand="0" w:oddHBand="0" w:evenHBand="0" w:firstRowFirstColumn="0" w:firstRowLastColumn="0" w:lastRowFirstColumn="0" w:lastRowLastColumn="0"/>
+            </w:pPr>
+            <w:r>
+              <w:rPr>
+                <w:rFonts w:ascii="Times New Roman" w:hAnsi="Times New Roman" w:eastAsia="Times New Roman"/>
+                <w:sz w:val="14"/>
+              </w:rPr>
+              <w:t>{{ e_iii_a_4 }}</w:t>
+            </w:r>
+          </w:p>
+        </w:tc>
+        <w:tc>
+          <w:tcPr>
+            <w:tcW w:w="0" w:type="auto"/>
+            <w:vAlign w:val="center"/>
+            <w:hideMark/>
+          </w:tcPr>
+          <w:p>
+            <w:pPr>
+              <w:spacing w:after="0" w:line="312" w:lineRule="auto"/>
+              <w:jc w:val="center"/>
+              <w:cnfStyle w:val="000000000000" w:firstRow="0" w:lastRow="0" w:firstColumn="0" w:lastColumn="0" w:oddVBand="0" w:evenVBand="0" w:oddHBand="0" w:evenHBand="0" w:firstRowFirstColumn="0" w:firstRowLastColumn="0" w:lastRowFirstColumn="0" w:lastRowLastColumn="0"/>
+            </w:pPr>
+            <w:r>
+              <w:rPr>
+                <w:rFonts w:ascii="Times New Roman" w:hAnsi="Times New Roman" w:eastAsia="Times New Roman"/>
+                <w:sz w:val="14"/>
+              </w:rPr>
+              <w:t>{{ n_iii_a_4 }}</w:t>
             </w:r>
           </w:p>
         </w:tc>
@@ -6528,41 +6312,53 @@
               <w:cnfStyle w:val="000000000000" w:firstRow="0" w:lastRow="0" w:firstColumn="0" w:lastColumn="0" w:oddVBand="0" w:evenVBand="0" w:oddHBand="0" w:evenHBand="0" w:firstRowFirstColumn="0" w:firstRowLastColumn="0" w:lastRowFirstColumn="0" w:lastRowLastColumn="0"/>
             </w:pPr>
             <w:r>
-              <w:t>…</w:t>
-            </w:r>
-          </w:p>
-        </w:tc>
-        <w:tc>
-          <w:tcPr>
-            <w:tcW w:w="0" w:type="auto"/>
-            <w:vAlign w:val="center"/>
-            <w:hideMark/>
-          </w:tcPr>
-          <w:p>
-            <w:pPr>
-              <w:spacing w:after="0" w:line="312" w:lineRule="auto"/>
-              <w:jc w:val="center"/>
-              <w:cnfStyle w:val="000000000000" w:firstRow="0" w:lastRow="0" w:firstColumn="0" w:lastColumn="0" w:oddVBand="0" w:evenVBand="0" w:oddHBand="0" w:evenHBand="0" w:firstRowFirstColumn="0" w:firstRowLastColumn="0" w:lastRowFirstColumn="0" w:lastRowLastColumn="0"/>
-            </w:pPr>
-            <w:r>
-              <w:t>Đề xuất cải tiến / Tài liệu / Sản phẩm bổ sung</w:t>
-            </w:r>
-          </w:p>
-        </w:tc>
-        <w:tc>
-          <w:tcPr>
-            <w:tcW w:w="0" w:type="auto"/>
-            <w:vAlign w:val="center"/>
-            <w:hideMark/>
-          </w:tcPr>
-          <w:p>
-            <w:pPr>
-              <w:spacing w:after="0" w:line="312" w:lineRule="auto"/>
-              <w:jc w:val="center"/>
-              <w:cnfStyle w:val="000000000000" w:firstRow="0" w:lastRow="0" w:firstColumn="0" w:lastColumn="0" w:oddVBand="0" w:evenVBand="0" w:oddHBand="0" w:evenHBand="0" w:firstRowFirstColumn="0" w:firstRowLastColumn="0" w:lastRowFirstColumn="0" w:lastRowLastColumn="0"/>
-            </w:pPr>
-            <w:r>
-              <w:t>…</w:t>
+              <w:rPr>
+                <w:rFonts w:ascii="Times New Roman" w:hAnsi="Times New Roman" w:eastAsia="Times New Roman"/>
+                <w:sz w:val="14"/>
+              </w:rPr>
+              <w:t>{{ s_iii_a_5 }}</w:t>
+            </w:r>
+          </w:p>
+        </w:tc>
+        <w:tc>
+          <w:tcPr>
+            <w:tcW w:w="0" w:type="auto"/>
+            <w:vAlign w:val="center"/>
+            <w:hideMark/>
+          </w:tcPr>
+          <w:p>
+            <w:pPr>
+              <w:spacing w:after="0" w:line="312" w:lineRule="auto"/>
+              <w:jc w:val="center"/>
+              <w:cnfStyle w:val="000000000000" w:firstRow="0" w:lastRow="0" w:firstColumn="0" w:lastColumn="0" w:oddVBand="0" w:evenVBand="0" w:oddHBand="0" w:evenHBand="0" w:firstRowFirstColumn="0" w:firstRowLastColumn="0" w:lastRowFirstColumn="0" w:lastRowLastColumn="0"/>
+            </w:pPr>
+            <w:r>
+              <w:rPr>
+                <w:rFonts w:ascii="Times New Roman" w:hAnsi="Times New Roman" w:eastAsia="Times New Roman"/>
+                <w:sz w:val="14"/>
+              </w:rPr>
+              <w:t>{{ e_iii_a_5 }}</w:t>
+            </w:r>
+          </w:p>
+        </w:tc>
+        <w:tc>
+          <w:tcPr>
+            <w:tcW w:w="0" w:type="auto"/>
+            <w:vAlign w:val="center"/>
+            <w:hideMark/>
+          </w:tcPr>
+          <w:p>
+            <w:pPr>
+              <w:spacing w:after="0" w:line="312" w:lineRule="auto"/>
+              <w:jc w:val="center"/>
+              <w:cnfStyle w:val="000000000000" w:firstRow="0" w:lastRow="0" w:firstColumn="0" w:lastColumn="0" w:oddVBand="0" w:evenVBand="0" w:oddHBand="0" w:evenHBand="0" w:firstRowFirstColumn="0" w:firstRowLastColumn="0" w:lastRowFirstColumn="0" w:lastRowLastColumn="0"/>
+            </w:pPr>
+            <w:r>
+              <w:rPr>
+                <w:rFonts w:ascii="Times New Roman" w:hAnsi="Times New Roman" w:eastAsia="Times New Roman"/>
+                <w:sz w:val="14"/>
+              </w:rPr>
+              <w:t>{{ n_iii_a_5 }}</w:t>
             </w:r>
           </w:p>
         </w:tc>
@@ -6636,9 +6432,10 @@
             </w:pPr>
             <w:r>
               <w:rPr>
-                <w:b/>
-              </w:rPr>
-              <w:t>…</w:t>
+                <w:rFonts w:ascii="Times New Roman" w:hAnsi="Times New Roman" w:eastAsia="Times New Roman"/>
+                <w:sz w:val="14"/>
+              </w:rPr>
+              <w:t>{{ component_iii_a_score }}</w:t>
             </w:r>
           </w:p>
         </w:tc>
@@ -6817,92 +6614,116 @@
               <w:jc w:val="center"/>
             </w:pPr>
             <w:r>
-              <w:t>Ban/Tổ chính: ……………</w:t>
-            </w:r>
-          </w:p>
-        </w:tc>
-        <w:tc>
-          <w:tcPr>
-            <w:tcW w:w="0" w:type="auto"/>
-            <w:vAlign w:val="center"/>
-            <w:hideMark/>
-          </w:tcPr>
-          <w:p>
-            <w:pPr>
-              <w:spacing w:after="0" w:line="312" w:lineRule="auto"/>
-              <w:jc w:val="center"/>
-              <w:cnfStyle w:val="000000000000" w:firstRow="0" w:lastRow="0" w:firstColumn="0" w:lastColumn="0" w:oddVBand="0" w:evenVBand="0" w:oddHBand="0" w:evenHBand="0" w:firstRowFirstColumn="0" w:firstRowLastColumn="0" w:lastRowFirstColumn="0" w:lastRowLastColumn="0"/>
-            </w:pPr>
-            <w:r>
-              <w:t>BCN / BCNg / BTT / BVH-NS / BVH-KL / BVH-HC / BVH-TC</w:t>
-            </w:r>
-          </w:p>
-        </w:tc>
-        <w:tc>
-          <w:tcPr>
-            <w:tcW w:w="0" w:type="auto"/>
-            <w:vAlign w:val="center"/>
-            <w:hideMark/>
-          </w:tcPr>
-          <w:p>
-            <w:pPr>
-              <w:spacing w:after="0" w:line="312" w:lineRule="auto"/>
-              <w:jc w:val="center"/>
-              <w:cnfStyle w:val="000000000000" w:firstRow="0" w:lastRow="0" w:firstColumn="0" w:lastColumn="0" w:oddVBand="0" w:evenVBand="0" w:oddHBand="0" w:evenHBand="0" w:firstRowFirstColumn="0" w:firstRowLastColumn="0" w:lastRowFirstColumn="0" w:lastRowLastColumn="0"/>
-            </w:pPr>
-            <w:r>
-              <w:t>…/100</w:t>
-            </w:r>
-          </w:p>
-        </w:tc>
-        <w:tc>
-          <w:tcPr>
-            <w:tcW w:w="0" w:type="auto"/>
-            <w:vAlign w:val="center"/>
-            <w:hideMark/>
-          </w:tcPr>
-          <w:p>
-            <w:pPr>
-              <w:spacing w:after="0" w:line="312" w:lineRule="auto"/>
-              <w:jc w:val="center"/>
-              <w:cnfStyle w:val="000000000000" w:firstRow="0" w:lastRow="0" w:firstColumn="0" w:lastColumn="0" w:oddVBand="0" w:evenVBand="0" w:oddHBand="0" w:evenHBand="0" w:firstRowFirstColumn="0" w:firstRowLastColumn="0" w:lastRowFirstColumn="0" w:lastRowLastColumn="0"/>
-            </w:pPr>
-            <w:r>
-              <w:t>…/20</w:t>
-            </w:r>
-          </w:p>
-        </w:tc>
-        <w:tc>
-          <w:tcPr>
-            <w:tcW w:w="0" w:type="auto"/>
-            <w:vAlign w:val="center"/>
-            <w:hideMark/>
-          </w:tcPr>
-          <w:p>
-            <w:pPr>
-              <w:spacing w:after="0" w:line="312" w:lineRule="auto"/>
-              <w:jc w:val="center"/>
-              <w:cnfStyle w:val="000000000000" w:firstRow="0" w:lastRow="0" w:firstColumn="0" w:lastColumn="0" w:oddVBand="0" w:evenVBand="0" w:oddHBand="0" w:evenHBand="0" w:firstRowFirstColumn="0" w:firstRowLastColumn="0" w:lastRowFirstColumn="0" w:lastRowLastColumn="0"/>
-            </w:pPr>
-            <w:r>
-              <w:t>…%</w:t>
-            </w:r>
-          </w:p>
-        </w:tc>
-        <w:tc>
-          <w:tcPr>
-            <w:tcW w:w="0" w:type="auto"/>
-            <w:vAlign w:val="center"/>
-            <w:hideMark/>
-          </w:tcPr>
-          <w:p>
-            <w:pPr>
-              <w:spacing w:after="0" w:line="312" w:lineRule="auto"/>
-              <w:jc w:val="center"/>
-              <w:cnfStyle w:val="000000000000" w:firstRow="0" w:lastRow="0" w:firstColumn="0" w:lastColumn="0" w:oddVBand="0" w:evenVBand="0" w:oddHBand="0" w:evenHBand="0" w:firstRowFirstColumn="0" w:firstRowLastColumn="0" w:lastRowFirstColumn="0" w:lastRowLastColumn="0"/>
-            </w:pPr>
-            <w:r>
-              <w:t>…</w:t>
+              <w:rPr>
+                <w:rFonts w:ascii="Times New Roman" w:hAnsi="Times New Roman" w:eastAsia="Times New Roman"/>
+                <w:sz w:val="14"/>
+              </w:rPr>
+              <w:t>Ban/Tổ: {{ iiib_main_unit }}</w:t>
+            </w:r>
+          </w:p>
+        </w:tc>
+        <w:tc>
+          <w:tcPr>
+            <w:tcW w:w="0" w:type="auto"/>
+            <w:vAlign w:val="center"/>
+            <w:hideMark/>
+          </w:tcPr>
+          <w:p>
+            <w:pPr>
+              <w:spacing w:after="0" w:line="312" w:lineRule="auto"/>
+              <w:jc w:val="center"/>
+              <w:cnfStyle w:val="000000000000" w:firstRow="0" w:lastRow="0" w:firstColumn="0" w:lastColumn="0" w:oddVBand="0" w:evenVBand="0" w:oddHBand="0" w:evenHBand="0" w:firstRowFirstColumn="0" w:firstRowLastColumn="0" w:lastRowFirstColumn="0" w:lastRowLastColumn="0"/>
+            </w:pPr>
+            <w:r>
+              <w:rPr>
+                <w:rFonts w:ascii="Times New Roman" w:hAnsi="Times New Roman" w:eastAsia="Times New Roman"/>
+                <w:sz w:val="14"/>
+              </w:rPr>
+              <w:t>{{ iiib_main_table }}</w:t>
+            </w:r>
+          </w:p>
+        </w:tc>
+        <w:tc>
+          <w:tcPr>
+            <w:tcW w:w="0" w:type="auto"/>
+            <w:vAlign w:val="center"/>
+            <w:hideMark/>
+          </w:tcPr>
+          <w:p>
+            <w:pPr>
+              <w:spacing w:after="0" w:line="312" w:lineRule="auto"/>
+              <w:jc w:val="center"/>
+              <w:cnfStyle w:val="000000000000" w:firstRow="0" w:lastRow="0" w:firstColumn="0" w:lastColumn="0" w:oddVBand="0" w:evenVBand="0" w:oddHBand="0" w:evenHBand="0" w:firstRowFirstColumn="0" w:firstRowLastColumn="0" w:lastRowFirstColumn="0" w:lastRowLastColumn="0"/>
+            </w:pPr>
+            <w:r>
+              <w:rPr>
+                <w:rFonts w:ascii="Times New Roman" w:hAnsi="Times New Roman" w:eastAsia="Times New Roman"/>
+                <w:sz w:val="14"/>
+              </w:rPr>
+              <w:t>{{ iiib_main_raw }}/100</w:t>
+            </w:r>
+          </w:p>
+        </w:tc>
+        <w:tc>
+          <w:tcPr>
+            <w:tcW w:w="0" w:type="auto"/>
+            <w:vAlign w:val="center"/>
+            <w:hideMark/>
+          </w:tcPr>
+          <w:p>
+            <w:pPr>
+              <w:spacing w:after="0" w:line="312" w:lineRule="auto"/>
+              <w:jc w:val="center"/>
+              <w:cnfStyle w:val="000000000000" w:firstRow="0" w:lastRow="0" w:firstColumn="0" w:lastColumn="0" w:oddVBand="0" w:evenVBand="0" w:oddHBand="0" w:evenHBand="0" w:firstRowFirstColumn="0" w:firstRowLastColumn="0" w:lastRowFirstColumn="0" w:lastRowLastColumn="0"/>
+            </w:pPr>
+            <w:r>
+              <w:rPr>
+                <w:rFonts w:ascii="Times New Roman" w:hAnsi="Times New Roman" w:eastAsia="Times New Roman"/>
+                <w:sz w:val="14"/>
+              </w:rPr>
+              <w:t>{{ iiib_main_converted }}/20</w:t>
+            </w:r>
+          </w:p>
+        </w:tc>
+        <w:tc>
+          <w:tcPr>
+            <w:tcW w:w="0" w:type="auto"/>
+            <w:vAlign w:val="center"/>
+            <w:hideMark/>
+          </w:tcPr>
+          <w:p>
+            <w:pPr>
+              <w:spacing w:after="0" w:line="312" w:lineRule="auto"/>
+              <w:jc w:val="center"/>
+              <w:cnfStyle w:val="000000000000" w:firstRow="0" w:lastRow="0" w:firstColumn="0" w:lastColumn="0" w:oddVBand="0" w:evenVBand="0" w:oddHBand="0" w:evenHBand="0" w:firstRowFirstColumn="0" w:firstRowLastColumn="0" w:lastRowFirstColumn="0" w:lastRowLastColumn="0"/>
+            </w:pPr>
+            <w:r>
+              <w:rPr>
+                <w:rFonts w:ascii="Times New Roman" w:hAnsi="Times New Roman" w:eastAsia="Times New Roman"/>
+                <w:sz w:val="14"/>
+              </w:rPr>
+              <w:t>{{ iiib_main_weight }}%</w:t>
+            </w:r>
+          </w:p>
+        </w:tc>
+        <w:tc>
+          <w:tcPr>
+            <w:tcW w:w="0" w:type="auto"/>
+            <w:vAlign w:val="center"/>
+            <w:hideMark/>
+          </w:tcPr>
+          <w:p>
+            <w:pPr>
+              <w:spacing w:after="0" w:line="312" w:lineRule="auto"/>
+              <w:jc w:val="center"/>
+              <w:cnfStyle w:val="000000000000" w:firstRow="0" w:lastRow="0" w:firstColumn="0" w:lastColumn="0" w:oddVBand="0" w:evenVBand="0" w:oddHBand="0" w:evenHBand="0" w:firstRowFirstColumn="0" w:firstRowLastColumn="0" w:lastRowFirstColumn="0" w:lastRowLastColumn="0"/>
+            </w:pPr>
+            <w:r>
+              <w:rPr>
+                <w:rFonts w:ascii="Times New Roman" w:hAnsi="Times New Roman" w:eastAsia="Times New Roman"/>
+                <w:sz w:val="14"/>
+              </w:rPr>
+              <w:t>{{ iiib_main_final }}</w:t>
             </w:r>
           </w:p>
         </w:tc>
@@ -6921,92 +6742,116 @@
               <w:jc w:val="center"/>
             </w:pPr>
             <w:r>
-              <w:t>Ban/Tổ phụ 1: ……………</w:t>
-            </w:r>
-          </w:p>
-        </w:tc>
-        <w:tc>
-          <w:tcPr>
-            <w:tcW w:w="0" w:type="auto"/>
-            <w:vAlign w:val="center"/>
-            <w:hideMark/>
-          </w:tcPr>
-          <w:p>
-            <w:pPr>
-              <w:spacing w:after="0" w:line="312" w:lineRule="auto"/>
-              <w:jc w:val="center"/>
-              <w:cnfStyle w:val="000000000000" w:firstRow="0" w:lastRow="0" w:firstColumn="0" w:lastColumn="0" w:oddVBand="0" w:evenVBand="0" w:oddHBand="0" w:evenHBand="0" w:firstRowFirstColumn="0" w:firstRowLastColumn="0" w:lastRowFirstColumn="0" w:lastRowLastColumn="0"/>
-            </w:pPr>
-            <w:r>
-              <w:t>……………</w:t>
-            </w:r>
-          </w:p>
-        </w:tc>
-        <w:tc>
-          <w:tcPr>
-            <w:tcW w:w="0" w:type="auto"/>
-            <w:vAlign w:val="center"/>
-            <w:hideMark/>
-          </w:tcPr>
-          <w:p>
-            <w:pPr>
-              <w:spacing w:after="0" w:line="312" w:lineRule="auto"/>
-              <w:jc w:val="center"/>
-              <w:cnfStyle w:val="000000000000" w:firstRow="0" w:lastRow="0" w:firstColumn="0" w:lastColumn="0" w:oddVBand="0" w:evenVBand="0" w:oddHBand="0" w:evenHBand="0" w:firstRowFirstColumn="0" w:firstRowLastColumn="0" w:lastRowFirstColumn="0" w:lastRowLastColumn="0"/>
-            </w:pPr>
-            <w:r>
-              <w:t>…/100</w:t>
-            </w:r>
-          </w:p>
-        </w:tc>
-        <w:tc>
-          <w:tcPr>
-            <w:tcW w:w="0" w:type="auto"/>
-            <w:vAlign w:val="center"/>
-            <w:hideMark/>
-          </w:tcPr>
-          <w:p>
-            <w:pPr>
-              <w:spacing w:after="0" w:line="312" w:lineRule="auto"/>
-              <w:jc w:val="center"/>
-              <w:cnfStyle w:val="000000000000" w:firstRow="0" w:lastRow="0" w:firstColumn="0" w:lastColumn="0" w:oddVBand="0" w:evenVBand="0" w:oddHBand="0" w:evenHBand="0" w:firstRowFirstColumn="0" w:firstRowLastColumn="0" w:lastRowFirstColumn="0" w:lastRowLastColumn="0"/>
-            </w:pPr>
-            <w:r>
-              <w:t>…/20</w:t>
-            </w:r>
-          </w:p>
-        </w:tc>
-        <w:tc>
-          <w:tcPr>
-            <w:tcW w:w="0" w:type="auto"/>
-            <w:vAlign w:val="center"/>
-            <w:hideMark/>
-          </w:tcPr>
-          <w:p>
-            <w:pPr>
-              <w:spacing w:after="0" w:line="312" w:lineRule="auto"/>
-              <w:jc w:val="center"/>
-              <w:cnfStyle w:val="000000000000" w:firstRow="0" w:lastRow="0" w:firstColumn="0" w:lastColumn="0" w:oddVBand="0" w:evenVBand="0" w:oddHBand="0" w:evenHBand="0" w:firstRowFirstColumn="0" w:firstRowLastColumn="0" w:lastRowFirstColumn="0" w:lastRowLastColumn="0"/>
-            </w:pPr>
-            <w:r>
-              <w:t>…%</w:t>
-            </w:r>
-          </w:p>
-        </w:tc>
-        <w:tc>
-          <w:tcPr>
-            <w:tcW w:w="0" w:type="auto"/>
-            <w:vAlign w:val="center"/>
-            <w:hideMark/>
-          </w:tcPr>
-          <w:p>
-            <w:pPr>
-              <w:spacing w:after="0" w:line="312" w:lineRule="auto"/>
-              <w:jc w:val="center"/>
-              <w:cnfStyle w:val="000000000000" w:firstRow="0" w:lastRow="0" w:firstColumn="0" w:lastColumn="0" w:oddVBand="0" w:evenVBand="0" w:oddHBand="0" w:evenHBand="0" w:firstRowFirstColumn="0" w:firstRowLastColumn="0" w:lastRowFirstColumn="0" w:lastRowLastColumn="0"/>
-            </w:pPr>
-            <w:r>
-              <w:t>…</w:t>
+              <w:rPr>
+                <w:rFonts w:ascii="Times New Roman" w:hAnsi="Times New Roman" w:eastAsia="Times New Roman"/>
+                <w:sz w:val="14"/>
+              </w:rPr>
+              <w:t>Ban/Tổ: {{ iiib_sub1_unit }}</w:t>
+            </w:r>
+          </w:p>
+        </w:tc>
+        <w:tc>
+          <w:tcPr>
+            <w:tcW w:w="0" w:type="auto"/>
+            <w:vAlign w:val="center"/>
+            <w:hideMark/>
+          </w:tcPr>
+          <w:p>
+            <w:pPr>
+              <w:spacing w:after="0" w:line="312" w:lineRule="auto"/>
+              <w:jc w:val="center"/>
+              <w:cnfStyle w:val="000000000000" w:firstRow="0" w:lastRow="0" w:firstColumn="0" w:lastColumn="0" w:oddVBand="0" w:evenVBand="0" w:oddHBand="0" w:evenHBand="0" w:firstRowFirstColumn="0" w:firstRowLastColumn="0" w:lastRowFirstColumn="0" w:lastRowLastColumn="0"/>
+            </w:pPr>
+            <w:r>
+              <w:rPr>
+                <w:rFonts w:ascii="Times New Roman" w:hAnsi="Times New Roman" w:eastAsia="Times New Roman"/>
+                <w:sz w:val="14"/>
+              </w:rPr>
+              <w:t>{{ iiib_sub1_table }}</w:t>
+            </w:r>
+          </w:p>
+        </w:tc>
+        <w:tc>
+          <w:tcPr>
+            <w:tcW w:w="0" w:type="auto"/>
+            <w:vAlign w:val="center"/>
+            <w:hideMark/>
+          </w:tcPr>
+          <w:p>
+            <w:pPr>
+              <w:spacing w:after="0" w:line="312" w:lineRule="auto"/>
+              <w:jc w:val="center"/>
+              <w:cnfStyle w:val="000000000000" w:firstRow="0" w:lastRow="0" w:firstColumn="0" w:lastColumn="0" w:oddVBand="0" w:evenVBand="0" w:oddHBand="0" w:evenHBand="0" w:firstRowFirstColumn="0" w:firstRowLastColumn="0" w:lastRowFirstColumn="0" w:lastRowLastColumn="0"/>
+            </w:pPr>
+            <w:r>
+              <w:rPr>
+                <w:rFonts w:ascii="Times New Roman" w:hAnsi="Times New Roman" w:eastAsia="Times New Roman"/>
+                <w:sz w:val="14"/>
+              </w:rPr>
+              <w:t>{{ iiib_sub1_raw }}/100</w:t>
+            </w:r>
+          </w:p>
+        </w:tc>
+        <w:tc>
+          <w:tcPr>
+            <w:tcW w:w="0" w:type="auto"/>
+            <w:vAlign w:val="center"/>
+            <w:hideMark/>
+          </w:tcPr>
+          <w:p>
+            <w:pPr>
+              <w:spacing w:after="0" w:line="312" w:lineRule="auto"/>
+              <w:jc w:val="center"/>
+              <w:cnfStyle w:val="000000000000" w:firstRow="0" w:lastRow="0" w:firstColumn="0" w:lastColumn="0" w:oddVBand="0" w:evenVBand="0" w:oddHBand="0" w:evenHBand="0" w:firstRowFirstColumn="0" w:firstRowLastColumn="0" w:lastRowFirstColumn="0" w:lastRowLastColumn="0"/>
+            </w:pPr>
+            <w:r>
+              <w:rPr>
+                <w:rFonts w:ascii="Times New Roman" w:hAnsi="Times New Roman" w:eastAsia="Times New Roman"/>
+                <w:sz w:val="14"/>
+              </w:rPr>
+              <w:t>{{ iiib_sub1_converted }}/20</w:t>
+            </w:r>
+          </w:p>
+        </w:tc>
+        <w:tc>
+          <w:tcPr>
+            <w:tcW w:w="0" w:type="auto"/>
+            <w:vAlign w:val="center"/>
+            <w:hideMark/>
+          </w:tcPr>
+          <w:p>
+            <w:pPr>
+              <w:spacing w:after="0" w:line="312" w:lineRule="auto"/>
+              <w:jc w:val="center"/>
+              <w:cnfStyle w:val="000000000000" w:firstRow="0" w:lastRow="0" w:firstColumn="0" w:lastColumn="0" w:oddVBand="0" w:evenVBand="0" w:oddHBand="0" w:evenHBand="0" w:firstRowFirstColumn="0" w:firstRowLastColumn="0" w:lastRowFirstColumn="0" w:lastRowLastColumn="0"/>
+            </w:pPr>
+            <w:r>
+              <w:rPr>
+                <w:rFonts w:ascii="Times New Roman" w:hAnsi="Times New Roman" w:eastAsia="Times New Roman"/>
+                <w:sz w:val="14"/>
+              </w:rPr>
+              <w:t>{{ iiib_sub1_weight }}%</w:t>
+            </w:r>
+          </w:p>
+        </w:tc>
+        <w:tc>
+          <w:tcPr>
+            <w:tcW w:w="0" w:type="auto"/>
+            <w:vAlign w:val="center"/>
+            <w:hideMark/>
+          </w:tcPr>
+          <w:p>
+            <w:pPr>
+              <w:spacing w:after="0" w:line="312" w:lineRule="auto"/>
+              <w:jc w:val="center"/>
+              <w:cnfStyle w:val="000000000000" w:firstRow="0" w:lastRow="0" w:firstColumn="0" w:lastColumn="0" w:oddVBand="0" w:evenVBand="0" w:oddHBand="0" w:evenHBand="0" w:firstRowFirstColumn="0" w:firstRowLastColumn="0" w:lastRowFirstColumn="0" w:lastRowLastColumn="0"/>
+            </w:pPr>
+            <w:r>
+              <w:rPr>
+                <w:rFonts w:ascii="Times New Roman" w:hAnsi="Times New Roman" w:eastAsia="Times New Roman"/>
+                <w:sz w:val="14"/>
+              </w:rPr>
+              <w:t>{{ iiib_sub1_final }}</w:t>
             </w:r>
           </w:p>
         </w:tc>
@@ -7025,92 +6870,116 @@
               <w:jc w:val="center"/>
             </w:pPr>
             <w:r>
-              <w:t>Ban/Tổ phụ 2: ……………</w:t>
-            </w:r>
-          </w:p>
-        </w:tc>
-        <w:tc>
-          <w:tcPr>
-            <w:tcW w:w="0" w:type="auto"/>
-            <w:vAlign w:val="center"/>
-            <w:hideMark/>
-          </w:tcPr>
-          <w:p>
-            <w:pPr>
-              <w:spacing w:after="0" w:line="312" w:lineRule="auto"/>
-              <w:jc w:val="center"/>
-              <w:cnfStyle w:val="000000000000" w:firstRow="0" w:lastRow="0" w:firstColumn="0" w:lastColumn="0" w:oddVBand="0" w:evenVBand="0" w:oddHBand="0" w:evenHBand="0" w:firstRowFirstColumn="0" w:firstRowLastColumn="0" w:lastRowFirstColumn="0" w:lastRowLastColumn="0"/>
-            </w:pPr>
-            <w:r>
-              <w:t>……………</w:t>
-            </w:r>
-          </w:p>
-        </w:tc>
-        <w:tc>
-          <w:tcPr>
-            <w:tcW w:w="0" w:type="auto"/>
-            <w:vAlign w:val="center"/>
-            <w:hideMark/>
-          </w:tcPr>
-          <w:p>
-            <w:pPr>
-              <w:spacing w:after="0" w:line="312" w:lineRule="auto"/>
-              <w:jc w:val="center"/>
-              <w:cnfStyle w:val="000000000000" w:firstRow="0" w:lastRow="0" w:firstColumn="0" w:lastColumn="0" w:oddVBand="0" w:evenVBand="0" w:oddHBand="0" w:evenHBand="0" w:firstRowFirstColumn="0" w:firstRowLastColumn="0" w:lastRowFirstColumn="0" w:lastRowLastColumn="0"/>
-            </w:pPr>
-            <w:r>
-              <w:t>…/100</w:t>
-            </w:r>
-          </w:p>
-        </w:tc>
-        <w:tc>
-          <w:tcPr>
-            <w:tcW w:w="0" w:type="auto"/>
-            <w:vAlign w:val="center"/>
-            <w:hideMark/>
-          </w:tcPr>
-          <w:p>
-            <w:pPr>
-              <w:spacing w:after="0" w:line="312" w:lineRule="auto"/>
-              <w:jc w:val="center"/>
-              <w:cnfStyle w:val="000000000000" w:firstRow="0" w:lastRow="0" w:firstColumn="0" w:lastColumn="0" w:oddVBand="0" w:evenVBand="0" w:oddHBand="0" w:evenHBand="0" w:firstRowFirstColumn="0" w:firstRowLastColumn="0" w:lastRowFirstColumn="0" w:lastRowLastColumn="0"/>
-            </w:pPr>
-            <w:r>
-              <w:t>…/20</w:t>
-            </w:r>
-          </w:p>
-        </w:tc>
-        <w:tc>
-          <w:tcPr>
-            <w:tcW w:w="0" w:type="auto"/>
-            <w:vAlign w:val="center"/>
-            <w:hideMark/>
-          </w:tcPr>
-          <w:p>
-            <w:pPr>
-              <w:spacing w:after="0" w:line="312" w:lineRule="auto"/>
-              <w:jc w:val="center"/>
-              <w:cnfStyle w:val="000000000000" w:firstRow="0" w:lastRow="0" w:firstColumn="0" w:lastColumn="0" w:oddVBand="0" w:evenVBand="0" w:oddHBand="0" w:evenHBand="0" w:firstRowFirstColumn="0" w:firstRowLastColumn="0" w:lastRowFirstColumn="0" w:lastRowLastColumn="0"/>
-            </w:pPr>
-            <w:r>
-              <w:t>…%</w:t>
-            </w:r>
-          </w:p>
-        </w:tc>
-        <w:tc>
-          <w:tcPr>
-            <w:tcW w:w="0" w:type="auto"/>
-            <w:vAlign w:val="center"/>
-            <w:hideMark/>
-          </w:tcPr>
-          <w:p>
-            <w:pPr>
-              <w:spacing w:after="0" w:line="312" w:lineRule="auto"/>
-              <w:jc w:val="center"/>
-              <w:cnfStyle w:val="000000000000" w:firstRow="0" w:lastRow="0" w:firstColumn="0" w:lastColumn="0" w:oddVBand="0" w:evenVBand="0" w:oddHBand="0" w:evenHBand="0" w:firstRowFirstColumn="0" w:firstRowLastColumn="0" w:lastRowFirstColumn="0" w:lastRowLastColumn="0"/>
-            </w:pPr>
-            <w:r>
-              <w:t>…</w:t>
+              <w:rPr>
+                <w:rFonts w:ascii="Times New Roman" w:hAnsi="Times New Roman" w:eastAsia="Times New Roman"/>
+                <w:sz w:val="14"/>
+              </w:rPr>
+              <w:t>Ban/Tổ: {{ iiib_sub2_unit }}</w:t>
+            </w:r>
+          </w:p>
+        </w:tc>
+        <w:tc>
+          <w:tcPr>
+            <w:tcW w:w="0" w:type="auto"/>
+            <w:vAlign w:val="center"/>
+            <w:hideMark/>
+          </w:tcPr>
+          <w:p>
+            <w:pPr>
+              <w:spacing w:after="0" w:line="312" w:lineRule="auto"/>
+              <w:jc w:val="center"/>
+              <w:cnfStyle w:val="000000000000" w:firstRow="0" w:lastRow="0" w:firstColumn="0" w:lastColumn="0" w:oddVBand="0" w:evenVBand="0" w:oddHBand="0" w:evenHBand="0" w:firstRowFirstColumn="0" w:firstRowLastColumn="0" w:lastRowFirstColumn="0" w:lastRowLastColumn="0"/>
+            </w:pPr>
+            <w:r>
+              <w:rPr>
+                <w:rFonts w:ascii="Times New Roman" w:hAnsi="Times New Roman" w:eastAsia="Times New Roman"/>
+                <w:sz w:val="14"/>
+              </w:rPr>
+              <w:t>{{ iiib_sub2_table }}</w:t>
+            </w:r>
+          </w:p>
+        </w:tc>
+        <w:tc>
+          <w:tcPr>
+            <w:tcW w:w="0" w:type="auto"/>
+            <w:vAlign w:val="center"/>
+            <w:hideMark/>
+          </w:tcPr>
+          <w:p>
+            <w:pPr>
+              <w:spacing w:after="0" w:line="312" w:lineRule="auto"/>
+              <w:jc w:val="center"/>
+              <w:cnfStyle w:val="000000000000" w:firstRow="0" w:lastRow="0" w:firstColumn="0" w:lastColumn="0" w:oddVBand="0" w:evenVBand="0" w:oddHBand="0" w:evenHBand="0" w:firstRowFirstColumn="0" w:firstRowLastColumn="0" w:lastRowFirstColumn="0" w:lastRowLastColumn="0"/>
+            </w:pPr>
+            <w:r>
+              <w:rPr>
+                <w:rFonts w:ascii="Times New Roman" w:hAnsi="Times New Roman" w:eastAsia="Times New Roman"/>
+                <w:sz w:val="14"/>
+              </w:rPr>
+              <w:t>{{ iiib_sub2_raw }}/100</w:t>
+            </w:r>
+          </w:p>
+        </w:tc>
+        <w:tc>
+          <w:tcPr>
+            <w:tcW w:w="0" w:type="auto"/>
+            <w:vAlign w:val="center"/>
+            <w:hideMark/>
+          </w:tcPr>
+          <w:p>
+            <w:pPr>
+              <w:spacing w:after="0" w:line="312" w:lineRule="auto"/>
+              <w:jc w:val="center"/>
+              <w:cnfStyle w:val="000000000000" w:firstRow="0" w:lastRow="0" w:firstColumn="0" w:lastColumn="0" w:oddVBand="0" w:evenVBand="0" w:oddHBand="0" w:evenHBand="0" w:firstRowFirstColumn="0" w:firstRowLastColumn="0" w:lastRowFirstColumn="0" w:lastRowLastColumn="0"/>
+            </w:pPr>
+            <w:r>
+              <w:rPr>
+                <w:rFonts w:ascii="Times New Roman" w:hAnsi="Times New Roman" w:eastAsia="Times New Roman"/>
+                <w:sz w:val="14"/>
+              </w:rPr>
+              <w:t>{{ iiib_sub2_converted }}/20</w:t>
+            </w:r>
+          </w:p>
+        </w:tc>
+        <w:tc>
+          <w:tcPr>
+            <w:tcW w:w="0" w:type="auto"/>
+            <w:vAlign w:val="center"/>
+            <w:hideMark/>
+          </w:tcPr>
+          <w:p>
+            <w:pPr>
+              <w:spacing w:after="0" w:line="312" w:lineRule="auto"/>
+              <w:jc w:val="center"/>
+              <w:cnfStyle w:val="000000000000" w:firstRow="0" w:lastRow="0" w:firstColumn="0" w:lastColumn="0" w:oddVBand="0" w:evenVBand="0" w:oddHBand="0" w:evenHBand="0" w:firstRowFirstColumn="0" w:firstRowLastColumn="0" w:lastRowFirstColumn="0" w:lastRowLastColumn="0"/>
+            </w:pPr>
+            <w:r>
+              <w:rPr>
+                <w:rFonts w:ascii="Times New Roman" w:hAnsi="Times New Roman" w:eastAsia="Times New Roman"/>
+                <w:sz w:val="14"/>
+              </w:rPr>
+              <w:t>{{ iiib_sub2_weight }}%</w:t>
+            </w:r>
+          </w:p>
+        </w:tc>
+        <w:tc>
+          <w:tcPr>
+            <w:tcW w:w="0" w:type="auto"/>
+            <w:vAlign w:val="center"/>
+            <w:hideMark/>
+          </w:tcPr>
+          <w:p>
+            <w:pPr>
+              <w:spacing w:after="0" w:line="312" w:lineRule="auto"/>
+              <w:jc w:val="center"/>
+              <w:cnfStyle w:val="000000000000" w:firstRow="0" w:lastRow="0" w:firstColumn="0" w:lastColumn="0" w:oddVBand="0" w:evenVBand="0" w:oddHBand="0" w:evenHBand="0" w:firstRowFirstColumn="0" w:firstRowLastColumn="0" w:lastRowFirstColumn="0" w:lastRowLastColumn="0"/>
+            </w:pPr>
+            <w:r>
+              <w:rPr>
+                <w:rFonts w:ascii="Times New Roman" w:hAnsi="Times New Roman" w:eastAsia="Times New Roman"/>
+                <w:sz w:val="14"/>
+              </w:rPr>
+              <w:t>{{ iiib_sub2_final }}</w:t>
             </w:r>
           </w:p>
         </w:tc>
@@ -7192,29 +7061,31 @@
             </w:pPr>
             <w:r>
               <w:rPr>
-                <w:b/>
-              </w:rPr>
-              <w:t>100%</w:t>
-            </w:r>
-          </w:p>
-        </w:tc>
-        <w:tc>
-          <w:tcPr>
-            <w:tcW w:w="0" w:type="auto"/>
-            <w:vAlign w:val="center"/>
-            <w:hideMark/>
-          </w:tcPr>
-          <w:p>
-            <w:pPr>
-              <w:spacing w:after="0" w:line="312" w:lineRule="auto"/>
-              <w:jc w:val="center"/>
-              <w:cnfStyle w:val="000000000000" w:firstRow="0" w:lastRow="0" w:firstColumn="0" w:lastColumn="0" w:oddVBand="0" w:evenVBand="0" w:oddHBand="0" w:evenHBand="0" w:firstRowFirstColumn="0" w:firstRowLastColumn="0" w:lastRowFirstColumn="0" w:lastRowLastColumn="0"/>
-            </w:pPr>
-            <w:r>
-              <w:rPr>
-                <w:b/>
-              </w:rPr>
-              <w:t>…/20</w:t>
+                <w:rFonts w:ascii="Times New Roman" w:hAnsi="Times New Roman" w:eastAsia="Times New Roman"/>
+                <w:sz w:val="14"/>
+              </w:rPr>
+              <w:t>{{ iiib_total_weight }}%</w:t>
+            </w:r>
+          </w:p>
+        </w:tc>
+        <w:tc>
+          <w:tcPr>
+            <w:tcW w:w="0" w:type="auto"/>
+            <w:vAlign w:val="center"/>
+            <w:hideMark/>
+          </w:tcPr>
+          <w:p>
+            <w:pPr>
+              <w:spacing w:after="0" w:line="312" w:lineRule="auto"/>
+              <w:jc w:val="center"/>
+              <w:cnfStyle w:val="000000000000" w:firstRow="0" w:lastRow="0" w:firstColumn="0" w:lastColumn="0" w:oddVBand="0" w:evenVBand="0" w:oddHBand="0" w:evenHBand="0" w:firstRowFirstColumn="0" w:firstRowLastColumn="0" w:lastRowFirstColumn="0" w:lastRowLastColumn="0"/>
+            </w:pPr>
+            <w:r>
+              <w:rPr>
+                <w:rFonts w:ascii="Times New Roman" w:hAnsi="Times New Roman" w:eastAsia="Times New Roman"/>
+                <w:sz w:val="14"/>
+              </w:rPr>
+              <w:t>{{ component_iii_b_score }}/20</w:t>
             </w:r>
           </w:p>
         </w:tc>
@@ -7285,6 +7156,7 @@
         <w:t>Điểm III-B đa ban = Tổng của từng điểm III-B sau quy đổi × tỷ trọng tham gia tương ứng.</w:t>
       </w:r>
     </w:p>
+    <w:p/>
     <w:p/>
     <w:sectPr>
       <w:footerReference w:type="default" r:id="rId10"/>

</xml_diff>